<commit_message>
docs: add banking-domain dimensions addendum to PRD and approach plan
Add section 11 bis (PRD) and 4.3 bis (approach plan): retail vs pro, bancassurance bundle, rate architecture, digital vs advisor, switching framing, regulatory disclosures, free-claim framing, fiscal calendar, ESG specificity, loyalty/CRM proxy, social media (keep or not), accessibility, SEO, plus a second pass (institutional trust signal, capped rate, youth/student targeting, secondary-bank positioning, expat targeting, green product, branch network).
</commit_message>
<xml_diff>
--- a/docs/ing-docs/use_case_description_beCode_campaign_comparator.docx
+++ b/docs/ing-docs/use_case_description_beCode_campaign_comparator.docx
@@ -1,58 +1,30 @@
 
 <file path=word/document.xml><?xml version="1.0" encoding="utf-8"?>
-<w:document xmlns:wpc="http://schemas.microsoft.com/office/word/2010/wordprocessingCanvas" xmlns:cx="http://schemas.microsoft.com/office/drawing/2014/chartex" xmlns:cx1="http://schemas.microsoft.com/office/drawing/2015/9/8/chartex" xmlns:cx2="http://schemas.microsoft.com/office/drawing/2015/10/21/chartex" xmlns:cx3="http://schemas.microsoft.com/office/drawing/2016/5/9/chartex" xmlns:cx4="http://schemas.microsoft.com/office/drawing/2016/5/10/chartex" xmlns:cx5="http://schemas.microsoft.com/office/drawing/2016/5/11/chartex" xmlns:cx6="http://schemas.microsoft.com/office/drawing/2016/5/12/chartex" xmlns:cx7="http://schemas.microsoft.com/office/drawing/2016/5/13/chartex" xmlns:cx8="http://schemas.microsoft.com/office/drawing/2016/5/14/chartex" xmlns:mc="http://schemas.openxmlformats.org/markup-compatibility/2006" xmlns:aink="http://schemas.microsoft.com/office/drawing/2016/ink" xmlns:am3d="http://schemas.microsoft.com/office/drawing/2017/model3d" xmlns:o="urn:schemas-microsoft-com:office:office" xmlns:oel="http://schemas.microsoft.com/office/2019/extlst" xmlns:r="http://schemas.openxmlformats.org/officeDocument/2006/relationships" xmlns:m="http://schemas.openxmlformats.org/officeDocument/2006/math" xmlns:v="urn:schemas-microsoft-com:vml" xmlns:wp14="http://schemas.microsoft.com/office/word/2010/wordprocessingDrawing" xmlns:wp="http://schemas.openxmlformats.org/drawingml/2006/wordprocessingDrawing" xmlns:w10="urn:schemas-microsoft-com:office:word" xmlns:w="http://schemas.openxmlformats.org/wordprocessingml/2006/main" xmlns:w14="http://schemas.microsoft.com/office/word/2010/wordml" xmlns:w15="http://schemas.microsoft.com/office/word/2012/wordml" xmlns:w16cex="http://schemas.microsoft.com/office/word/2018/wordml/cex" xmlns:w16cid="http://schemas.microsoft.com/office/word/2016/wordml/cid" xmlns:w16="http://schemas.microsoft.com/office/word/2018/wordml" xmlns:w16du="http://schemas.microsoft.com/office/word/2023/wordml/word16du" xmlns:w16sdtdh="http://schemas.microsoft.com/office/word/2020/wordml/sdtdatahash" xmlns:w16sdtfl="http://schemas.microsoft.com/office/word/2024/wordml/sdtformatlock" xmlns:w16se="http://schemas.microsoft.com/office/word/2015/wordml/symex" xmlns:wpg="http://schemas.microsoft.com/office/word/2010/wordprocessingGroup" xmlns:wpi="http://schemas.microsoft.com/office/word/2010/wordprocessingInk" xmlns:wne="http://schemas.microsoft.com/office/word/2006/wordml" xmlns:wps="http://schemas.microsoft.com/office/word/2010/wordprocessingShape" mc:Ignorable="w14 w15 w16se w16cid w16 w16cex w16sdtdh w16sdtfl w16du wp14">
+<w:document xmlns:wpc="http://schemas.microsoft.com/office/word/2010/wordprocessingCanvas" xmlns:cx="http://schemas.microsoft.com/office/drawing/2014/chartex" xmlns:cx1="http://schemas.microsoft.com/office/drawing/2015/9/8/chartex" xmlns:cx2="http://schemas.microsoft.com/office/drawing/2015/10/21/chartex" xmlns:cx3="http://schemas.microsoft.com/office/drawing/2016/5/9/chartex" xmlns:cx4="http://schemas.microsoft.com/office/drawing/2016/5/10/chartex" xmlns:cx5="http://schemas.microsoft.com/office/drawing/2016/5/11/chartex" xmlns:cx6="http://schemas.microsoft.com/office/drawing/2016/5/12/chartex" xmlns:cx7="http://schemas.microsoft.com/office/drawing/2016/5/13/chartex" xmlns:cx8="http://schemas.microsoft.com/office/drawing/2016/5/14/chartex" xmlns:mc="http://schemas.openxmlformats.org/markup-compatibility/2006" xmlns:aink="http://schemas.microsoft.com/office/drawing/2016/ink" xmlns:am3d="http://schemas.microsoft.com/office/drawing/2017/model3d" xmlns:o="urn:schemas-microsoft-com:office:office" xmlns:oel="http://schemas.microsoft.com/office/2019/extlst" xmlns:r="http://schemas.openxmlformats.org/officeDocument/2006/relationships" xmlns:m="http://schemas.openxmlformats.org/officeDocument/2006/math" xmlns:v="urn:schemas-microsoft-com:vml" xmlns:wp14="http://schemas.microsoft.com/office/word/2010/wordprocessingDrawing" xmlns:wp="http://schemas.openxmlformats.org/drawingml/2006/wordprocessingDrawing" xmlns:w10="urn:schemas-microsoft-com:office:word" xmlns:w="http://schemas.openxmlformats.org/wordprocessingml/2006/main" xmlns:w14="http://schemas.microsoft.com/office/word/2010/wordml" xmlns:w15="http://schemas.microsoft.com/office/word/2012/wordml" xmlns:w16cex="http://schemas.microsoft.com/office/word/2018/wordml/cex" xmlns:w16cid="http://schemas.microsoft.com/office/word/2016/wordml/cid" xmlns:w16="http://schemas.microsoft.com/office/word/2018/wordml" xmlns:w16sdtdh="http://schemas.microsoft.com/office/word/2020/wordml/sdtdatahash" xmlns:w16se="http://schemas.microsoft.com/office/word/2015/wordml/symex" xmlns:wpg="http://schemas.microsoft.com/office/word/2010/wordprocessingGroup" xmlns:wpi="http://schemas.microsoft.com/office/word/2010/wordprocessingInk" xmlns:wne="http://schemas.microsoft.com/office/word/2006/wordml" xmlns:wps="http://schemas.microsoft.com/office/word/2010/wordprocessingShape" mc:Ignorable="w14 w15 w16se w16cid w16 w16cex w16sdtdh wp14">
   <w:body>
     <w:p>
       <w:pPr>
         <w:pStyle w:val="Heading1"/>
-        <w:rPr>
-          <w:lang w:val="en-BE"/>
-        </w:rPr>
-      </w:pPr>
-      <w:r>
-        <w:rPr>
-          <w:lang w:val="en-BE"/>
-        </w:rPr>
+      </w:pPr>
+      <w:r>
         <w:t>Banking campaigns comparator</w:t>
       </w:r>
     </w:p>
     <w:p>
       <w:pPr>
         <w:pStyle w:val="Heading2"/>
-        <w:rPr>
-          <w:lang w:val="en-BE"/>
-        </w:rPr>
-      </w:pPr>
-      <w:r>
-        <w:rPr>
-          <w:lang w:val="en-BE"/>
-        </w:rPr>
+      </w:pPr>
+      <w:r>
         <w:t>Context</w:t>
       </w:r>
     </w:p>
     <w:p>
-      <w:pPr>
-        <w:rPr>
-          <w:lang w:val="en-BE"/>
-        </w:rPr>
-      </w:pPr>
-      <w:r>
-        <w:rPr>
-          <w:lang w:val="en-BE"/>
-        </w:rPr>
+      <w:r>
         <w:t>In Belgium, banks don’t present themselves in the same way. Traditional players and newer digital banks (neobanks) use very different approaches to explain their products, attract customers, and position their brand.</w:t>
       </w:r>
     </w:p>
     <w:p>
-      <w:pPr>
-        <w:rPr>
-          <w:lang w:val="en-BE"/>
-        </w:rPr>
-      </w:pPr>
-      <w:r>
-        <w:rPr>
-          <w:lang w:val="en-BE"/>
-        </w:rPr>
+      <w:r>
         <w:t>For ING, understanding these differences is not just an academic exercise. It helps answer practical questions:</w:t>
       </w:r>
     </w:p>
@@ -62,14 +34,8 @@
           <w:ilvl w:val="0"/>
           <w:numId w:val="1"/>
         </w:numPr>
-        <w:rPr>
-          <w:lang w:val="en-BE"/>
-        </w:rPr>
-      </w:pPr>
-      <w:r>
-        <w:rPr>
-          <w:lang w:val="en-BE"/>
-        </w:rPr>
+      </w:pPr>
+      <w:r>
         <w:t>How do we present ourselves compared to the rest of the market? </w:t>
       </w:r>
     </w:p>
@@ -79,14 +45,8 @@
           <w:ilvl w:val="0"/>
           <w:numId w:val="1"/>
         </w:numPr>
-        <w:rPr>
-          <w:lang w:val="en-BE"/>
-        </w:rPr>
-      </w:pPr>
-      <w:r>
-        <w:rPr>
-          <w:lang w:val="en-BE"/>
-        </w:rPr>
+      </w:pPr>
+      <w:r>
         <w:t>What do others do similarly or differently? </w:t>
       </w:r>
     </w:p>
@@ -96,69 +56,33 @@
           <w:ilvl w:val="0"/>
           <w:numId w:val="1"/>
         </w:numPr>
-        <w:rPr>
-          <w:lang w:val="en-BE"/>
-        </w:rPr>
-      </w:pPr>
-      <w:r>
-        <w:rPr>
-          <w:lang w:val="en-BE"/>
-        </w:rPr>
+      </w:pPr>
+      <w:r>
         <w:t>Where could we improve how we design and communicate our campaigns? </w:t>
       </w:r>
     </w:p>
     <w:p>
-      <w:pPr>
-        <w:rPr>
-          <w:lang w:val="en-BE"/>
-        </w:rPr>
-      </w:pPr>
-      <w:r>
-        <w:rPr>
-          <w:lang w:val="en-BE"/>
-        </w:rPr>
+      <w:r>
         <w:pict w14:anchorId="66057C06">
-          <v:rect id="_x0000_i1091" style="width:0;height:1.5pt" o:hralign="center" o:hrstd="t" o:hr="t" fillcolor="#a0a0a0" stroked="f"/>
+          <v:rect id="_x0000_i1025" style="width:0;height:1.5pt" o:hralign="center" o:hrstd="t" o:hr="t" fillcolor="#a0a0a0" stroked="f"/>
         </w:pict>
       </w:r>
     </w:p>
     <w:p>
       <w:pPr>
         <w:pStyle w:val="Heading2"/>
-        <w:rPr>
-          <w:lang w:val="en-BE"/>
-        </w:rPr>
-      </w:pPr>
-      <w:r>
-        <w:rPr>
-          <w:lang w:val="en-BE"/>
-        </w:rPr>
+      </w:pPr>
+      <w:r>
         <w:t>Objective</w:t>
       </w:r>
     </w:p>
     <w:p>
-      <w:pPr>
-        <w:rPr>
-          <w:lang w:val="en-BE"/>
-        </w:rPr>
-      </w:pPr>
-      <w:r>
-        <w:rPr>
-          <w:lang w:val="en-BE"/>
-        </w:rPr>
+      <w:r>
         <w:t>Your task is to analyse and compare how banks present their campaigns online.</w:t>
       </w:r>
     </w:p>
     <w:p>
-      <w:pPr>
-        <w:rPr>
-          <w:lang w:val="en-BE"/>
-        </w:rPr>
-      </w:pPr>
-      <w:r>
-        <w:rPr>
-          <w:lang w:val="en-BE"/>
-        </w:rPr>
+      <w:r>
         <w:t>You should aim to answer questions such as:</w:t>
       </w:r>
     </w:p>
@@ -168,14 +92,8 @@
           <w:ilvl w:val="0"/>
           <w:numId w:val="2"/>
         </w:numPr>
-        <w:rPr>
-          <w:lang w:val="en-BE"/>
-        </w:rPr>
-      </w:pPr>
-      <w:r>
-        <w:rPr>
-          <w:lang w:val="en-BE"/>
-        </w:rPr>
+      </w:pPr>
+      <w:r>
         <w:t>Where does ING stand compared to competitors? </w:t>
       </w:r>
     </w:p>
@@ -185,14 +103,8 @@
           <w:ilvl w:val="0"/>
           <w:numId w:val="2"/>
         </w:numPr>
-        <w:rPr>
-          <w:lang w:val="en-BE"/>
-        </w:rPr>
-      </w:pPr>
-      <w:r>
-        <w:rPr>
-          <w:lang w:val="en-BE"/>
-        </w:rPr>
+      </w:pPr>
+      <w:r>
         <w:t>Are we closer to traditional banks or to challenger banks? </w:t>
       </w:r>
     </w:p>
@@ -202,14 +114,8 @@
           <w:ilvl w:val="0"/>
           <w:numId w:val="2"/>
         </w:numPr>
-        <w:rPr>
-          <w:lang w:val="en-BE"/>
-        </w:rPr>
-      </w:pPr>
-      <w:r>
-        <w:rPr>
-          <w:lang w:val="en-BE"/>
-        </w:rPr>
+      </w:pPr>
+      <w:r>
         <w:t>Which banks use similar communication strategies? </w:t>
       </w:r>
     </w:p>
@@ -219,96 +125,48 @@
           <w:ilvl w:val="0"/>
           <w:numId w:val="2"/>
         </w:numPr>
-        <w:rPr>
-          <w:lang w:val="en-BE"/>
-        </w:rPr>
-      </w:pPr>
-      <w:r>
-        <w:rPr>
-          <w:lang w:val="en-BE"/>
-        </w:rPr>
+      </w:pPr>
+      <w:r>
         <w:t>What patterns do you observe in how campaigns are structured and delivered?   </w:t>
       </w:r>
     </w:p>
     <w:p>
-      <w:pPr>
-        <w:rPr>
-          <w:lang w:val="en-BE"/>
-        </w:rPr>
-      </w:pPr>
-      <w:r>
-        <w:rPr>
-          <w:lang w:val="en-BE"/>
-        </w:rPr>
+      <w:r>
         <w:t>In parallel, you will start building something more reusable: </w:t>
       </w:r>
     </w:p>
     <w:p>
-      <w:pPr>
-        <w:rPr>
-          <w:lang w:val="en-BE"/>
-        </w:rPr>
-      </w:pPr>
-      <w:r>
-        <w:rPr>
-          <w:lang w:val="en-BE"/>
-        </w:rPr>
+      <w:r>
         <w:t xml:space="preserve">a </w:t>
       </w:r>
       <w:r>
         <w:rPr>
           <w:b/>
           <w:bCs/>
-          <w:lang w:val="en-BE"/>
         </w:rPr>
         <w:t>set of features</w:t>
       </w:r>
       <w:r>
-        <w:rPr>
-          <w:lang w:val="en-BE"/>
-        </w:rPr>
         <w:t xml:space="preserve"> that describe campaigns in a structured way, which could later be used in larger-scale analysis or modelling.</w:t>
       </w:r>
     </w:p>
     <w:p>
-      <w:pPr>
-        <w:rPr>
-          <w:lang w:val="en-BE"/>
-        </w:rPr>
-      </w:pPr>
-      <w:r>
-        <w:rPr>
-          <w:lang w:val="en-BE"/>
-        </w:rPr>
+      <w:r>
         <w:pict w14:anchorId="7B73CF50">
-          <v:rect id="_x0000_i1092" style="width:0;height:1.5pt" o:hralign="center" o:hrstd="t" o:hr="t" fillcolor="#a0a0a0" stroked="f"/>
+          <v:rect id="_x0000_i1026" style="width:0;height:1.5pt" o:hralign="center" o:hrstd="t" o:hr="t" fillcolor="#a0a0a0" stroked="f"/>
         </w:pict>
       </w:r>
     </w:p>
     <w:p>
       <w:pPr>
         <w:pStyle w:val="Heading3"/>
-        <w:rPr>
-          <w:lang w:val="en-BE"/>
-        </w:rPr>
-      </w:pPr>
-      <w:r>
-        <w:rPr>
-          <w:lang w:val="en-BE"/>
-        </w:rPr>
+      </w:pPr>
+      <w:r>
         <w:t>Banks to Consider</w:t>
       </w:r>
     </w:p>
     <w:p>
-      <w:pPr>
-        <w:rPr>
-          <w:lang w:val="en-BE"/>
-        </w:rPr>
-      </w:pPr>
-      <w:r>
-        <w:rPr>
-          <w:lang w:val="en-BE"/>
-        </w:rPr>
+      <w:r>
         <w:t>You can work with a mix of traditional and digital banks:</w:t>
       </w:r>
     </w:p>
@@ -317,14 +175,12 @@
         <w:rPr>
           <w:b/>
           <w:bCs/>
-          <w:lang w:val="en-BE"/>
         </w:rPr>
       </w:pPr>
       <w:r>
         <w:rPr>
           <w:b/>
           <w:bCs/>
-          <w:lang w:val="en-BE"/>
         </w:rPr>
         <w:t>Traditional banks</w:t>
       </w:r>
@@ -335,14 +191,8 @@
           <w:ilvl w:val="0"/>
           <w:numId w:val="3"/>
         </w:numPr>
-        <w:rPr>
-          <w:lang w:val="en-BE"/>
-        </w:rPr>
-      </w:pPr>
-      <w:r>
-        <w:rPr>
-          <w:lang w:val="en-BE"/>
-        </w:rPr>
+      </w:pPr>
+      <w:r>
         <w:t>ING </w:t>
       </w:r>
     </w:p>
@@ -352,14 +202,8 @@
           <w:ilvl w:val="0"/>
           <w:numId w:val="3"/>
         </w:numPr>
-        <w:rPr>
-          <w:lang w:val="en-BE"/>
-        </w:rPr>
-      </w:pPr>
-      <w:r>
-        <w:rPr>
-          <w:lang w:val="en-BE"/>
-        </w:rPr>
+      </w:pPr>
+      <w:r>
         <w:t>KBC </w:t>
       </w:r>
     </w:p>
@@ -369,14 +213,8 @@
           <w:ilvl w:val="0"/>
           <w:numId w:val="3"/>
         </w:numPr>
-        <w:rPr>
-          <w:lang w:val="en-BE"/>
-        </w:rPr>
-      </w:pPr>
-      <w:r>
-        <w:rPr>
-          <w:lang w:val="en-BE"/>
-        </w:rPr>
+      </w:pPr>
+      <w:r>
         <w:t>BNP Paribas Fortis </w:t>
       </w:r>
     </w:p>
@@ -386,14 +224,9 @@
           <w:ilvl w:val="0"/>
           <w:numId w:val="3"/>
         </w:numPr>
-        <w:rPr>
-          <w:lang w:val="en-BE"/>
-        </w:rPr>
-      </w:pPr>
-      <w:r>
-        <w:rPr>
-          <w:lang w:val="en-BE"/>
-        </w:rPr>
+      </w:pPr>
+      <w:r>
+        <w:lastRenderedPageBreak/>
         <w:t>Argenta </w:t>
       </w:r>
     </w:p>
@@ -403,28 +236,16 @@
           <w:ilvl w:val="0"/>
           <w:numId w:val="3"/>
         </w:numPr>
-        <w:rPr>
-          <w:lang w:val="en-BE"/>
-        </w:rPr>
-      </w:pPr>
-      <w:r>
-        <w:rPr>
-          <w:lang w:val="en-BE"/>
-        </w:rPr>
+      </w:pPr>
+      <w:r>
         <w:t>Crelan </w:t>
       </w:r>
     </w:p>
     <w:p>
       <w:pPr>
         <w:pStyle w:val="Heading3"/>
-        <w:rPr>
-          <w:lang w:val="en-BE"/>
-        </w:rPr>
-      </w:pPr>
-      <w:r>
-        <w:rPr>
-          <w:lang w:val="en-BE"/>
-        </w:rPr>
+      </w:pPr>
+      <w:r>
         <w:t>Neobanks / challengers</w:t>
       </w:r>
     </w:p>
@@ -434,14 +255,8 @@
           <w:ilvl w:val="0"/>
           <w:numId w:val="4"/>
         </w:numPr>
-        <w:rPr>
-          <w:lang w:val="en-BE"/>
-        </w:rPr>
-      </w:pPr>
-      <w:r>
-        <w:rPr>
-          <w:lang w:val="en-BE"/>
-        </w:rPr>
+      </w:pPr>
+      <w:r>
         <w:t>Revolut </w:t>
       </w:r>
     </w:p>
@@ -451,14 +266,8 @@
           <w:ilvl w:val="0"/>
           <w:numId w:val="4"/>
         </w:numPr>
-        <w:rPr>
-          <w:lang w:val="en-BE"/>
-        </w:rPr>
-      </w:pPr>
-      <w:r>
-        <w:rPr>
-          <w:lang w:val="en-BE"/>
-        </w:rPr>
+      </w:pPr>
+      <w:r>
         <w:t>N26 </w:t>
       </w:r>
     </w:p>
@@ -468,132 +277,54 @@
           <w:ilvl w:val="0"/>
           <w:numId w:val="4"/>
         </w:numPr>
-        <w:rPr>
-          <w:lang w:val="en-BE"/>
-        </w:rPr>
-      </w:pPr>
-      <w:proofErr w:type="spellStart"/>
-      <w:r>
-        <w:rPr>
-          <w:lang w:val="en-BE"/>
-        </w:rPr>
-        <w:t>bunq</w:t>
-      </w:r>
-      <w:proofErr w:type="spellEnd"/>
-      <w:r>
-        <w:rPr>
-          <w:lang w:val="en-BE"/>
-        </w:rPr>
-        <w:t> </w:t>
-      </w:r>
-    </w:p>
-    <w:p>
-      <w:pPr>
-        <w:rPr>
-          <w:lang w:val="en-BE"/>
-        </w:rPr>
-      </w:pPr>
-      <w:r>
-        <w:rPr>
-          <w:lang w:val="en-BE"/>
-        </w:rPr>
+      </w:pPr>
+      <w:r>
+        <w:t>bunq </w:t>
+      </w:r>
+    </w:p>
+    <w:p>
+      <w:r>
         <w:t>You are not expected to cover everything. </w:t>
       </w:r>
     </w:p>
     <w:p>
-      <w:pPr>
-        <w:rPr>
-          <w:lang w:val="en-BE"/>
-        </w:rPr>
-      </w:pPr>
-      <w:r>
-        <w:rPr>
-          <w:lang w:val="en-BE"/>
-        </w:rPr>
+      <w:r>
         <w:t xml:space="preserve">Part of the work is to </w:t>
       </w:r>
       <w:r>
         <w:rPr>
           <w:b/>
           <w:bCs/>
-          <w:lang w:val="en-BE"/>
         </w:rPr>
         <w:t>decide what is relevant and justify your scope</w:t>
       </w:r>
       <w:r>
-        <w:rPr>
-          <w:lang w:val="en-BE"/>
-        </w:rPr>
         <w:t>.</w:t>
       </w:r>
     </w:p>
     <w:p>
-      <w:pPr>
-        <w:rPr>
-          <w:lang w:val="en-BE"/>
-        </w:rPr>
-      </w:pPr>
-      <w:r>
-        <w:rPr>
-          <w:lang w:val="en-BE"/>
-        </w:rPr>
+      <w:r>
         <w:pict w14:anchorId="24E527CD">
-          <v:rect id="_x0000_i1093" style="width:0;height:1.5pt" o:hralign="center" o:hrstd="t" o:hr="t" fillcolor="#a0a0a0" stroked="f"/>
+          <v:rect id="_x0000_i1027" style="width:0;height:1.5pt" o:hralign="center" o:hrstd="t" o:hr="t" fillcolor="#a0a0a0" stroked="f"/>
         </w:pict>
       </w:r>
     </w:p>
     <w:p>
       <w:pPr>
         <w:pStyle w:val="Heading2"/>
-        <w:rPr>
-          <w:lang w:val="en-BE"/>
-        </w:rPr>
-      </w:pPr>
-      <w:r>
-        <w:rPr>
-          <w:lang w:val="en-BE"/>
-        </w:rPr>
+      </w:pPr>
+      <w:r>
         <w:t>What This Project Is Really About</w:t>
       </w:r>
     </w:p>
     <w:p>
-      <w:pPr>
-        <w:rPr>
-          <w:lang w:val="en-BE"/>
-        </w:rPr>
-      </w:pPr>
-      <w:r>
-        <w:rPr>
-          <w:lang w:val="en-BE"/>
-        </w:rPr>
+      <w:r>
         <w:t>  This is not a modelling exercise.</w:t>
       </w:r>
     </w:p>
     <w:p>
-      <w:pPr>
-        <w:rPr>
-          <w:lang w:val="en-BE"/>
-        </w:rPr>
-      </w:pPr>
-      <w:r>
-        <w:rPr>
-          <w:lang w:val="en-BE"/>
-        </w:rPr>
-        <w:t xml:space="preserve">It’s closer to what a data scientist </w:t>
-      </w:r>
-      <w:proofErr w:type="gramStart"/>
-      <w:r>
-        <w:rPr>
-          <w:lang w:val="en-BE"/>
-        </w:rPr>
-        <w:t>actually does</w:t>
-      </w:r>
-      <w:proofErr w:type="gramEnd"/>
-      <w:r>
-        <w:rPr>
-          <w:lang w:val="en-BE"/>
-        </w:rPr>
-        <w:t xml:space="preserve"> in practice:</w:t>
+      <w:r>
+        <w:t>It’s closer to what a data scientist actually does in practice:</w:t>
       </w:r>
     </w:p>
     <w:p>
@@ -602,14 +333,8 @@
           <w:ilvl w:val="0"/>
           <w:numId w:val="5"/>
         </w:numPr>
-        <w:rPr>
-          <w:lang w:val="en-BE"/>
-        </w:rPr>
-      </w:pPr>
-      <w:r>
-        <w:rPr>
-          <w:lang w:val="en-BE"/>
-        </w:rPr>
+      </w:pPr>
+      <w:r>
         <w:t>deciding what is worth analysing </w:t>
       </w:r>
     </w:p>
@@ -619,14 +344,8 @@
           <w:ilvl w:val="0"/>
           <w:numId w:val="5"/>
         </w:numPr>
-        <w:rPr>
-          <w:lang w:val="en-BE"/>
-        </w:rPr>
-      </w:pPr>
-      <w:r>
-        <w:rPr>
-          <w:lang w:val="en-BE"/>
-        </w:rPr>
+      </w:pPr>
+      <w:r>
         <w:t>understanding what data is available (and what is not) </w:t>
       </w:r>
     </w:p>
@@ -636,14 +355,8 @@
           <w:ilvl w:val="0"/>
           <w:numId w:val="5"/>
         </w:numPr>
-        <w:rPr>
-          <w:lang w:val="en-BE"/>
-        </w:rPr>
-      </w:pPr>
-      <w:r>
-        <w:rPr>
-          <w:lang w:val="en-BE"/>
-        </w:rPr>
+      </w:pPr>
+      <w:r>
         <w:t>working with messy, unstructured information </w:t>
       </w:r>
     </w:p>
@@ -653,14 +366,8 @@
           <w:ilvl w:val="0"/>
           <w:numId w:val="5"/>
         </w:numPr>
-        <w:rPr>
-          <w:lang w:val="en-BE"/>
-        </w:rPr>
-      </w:pPr>
-      <w:r>
-        <w:rPr>
-          <w:lang w:val="en-BE"/>
-        </w:rPr>
+      </w:pPr>
+      <w:r>
         <w:t>making reasonable assumptions </w:t>
       </w:r>
     </w:p>
@@ -670,27 +377,13 @@
           <w:ilvl w:val="0"/>
           <w:numId w:val="5"/>
         </w:numPr>
-        <w:rPr>
-          <w:lang w:val="en-BE"/>
-        </w:rPr>
-      </w:pPr>
-      <w:r>
-        <w:rPr>
-          <w:lang w:val="en-BE"/>
-        </w:rPr>
+      </w:pPr>
+      <w:r>
         <w:t>explaining results clearly to others   </w:t>
       </w:r>
     </w:p>
     <w:p>
-      <w:pPr>
-        <w:rPr>
-          <w:lang w:val="en-BE"/>
-        </w:rPr>
-      </w:pPr>
-      <w:r>
-        <w:rPr>
-          <w:lang w:val="en-BE"/>
-        </w:rPr>
+      <w:r>
         <w:t>You will move across the full workflow:</w:t>
       </w:r>
     </w:p>
@@ -700,14 +393,8 @@
           <w:ilvl w:val="0"/>
           <w:numId w:val="6"/>
         </w:numPr>
-        <w:rPr>
-          <w:lang w:val="en-BE"/>
-        </w:rPr>
-      </w:pPr>
-      <w:r>
-        <w:rPr>
-          <w:lang w:val="en-BE"/>
-        </w:rPr>
+      </w:pPr>
+      <w:r>
         <w:t>framing the problem </w:t>
       </w:r>
     </w:p>
@@ -717,14 +404,8 @@
           <w:ilvl w:val="0"/>
           <w:numId w:val="6"/>
         </w:numPr>
-        <w:rPr>
-          <w:lang w:val="en-BE"/>
-        </w:rPr>
-      </w:pPr>
-      <w:r>
-        <w:rPr>
-          <w:lang w:val="en-BE"/>
-        </w:rPr>
+      </w:pPr>
+      <w:r>
         <w:t>collecting and structuring data </w:t>
       </w:r>
     </w:p>
@@ -734,14 +415,8 @@
           <w:ilvl w:val="0"/>
           <w:numId w:val="6"/>
         </w:numPr>
-        <w:rPr>
-          <w:lang w:val="en-BE"/>
-        </w:rPr>
-      </w:pPr>
-      <w:r>
-        <w:rPr>
-          <w:lang w:val="en-BE"/>
-        </w:rPr>
+      </w:pPr>
+      <w:r>
         <w:t>analysing it </w:t>
       </w:r>
     </w:p>
@@ -751,83 +426,43 @@
           <w:ilvl w:val="0"/>
           <w:numId w:val="6"/>
         </w:numPr>
-        <w:rPr>
-          <w:lang w:val="en-BE"/>
-        </w:rPr>
-      </w:pPr>
-      <w:r>
-        <w:rPr>
-          <w:lang w:val="en-BE"/>
-        </w:rPr>
+      </w:pPr>
+      <w:r>
         <w:t>presenting your conclusions </w:t>
       </w:r>
     </w:p>
     <w:p>
-      <w:pPr>
-        <w:rPr>
-          <w:lang w:val="en-BE"/>
-        </w:rPr>
-      </w:pPr>
-      <w:r>
-        <w:rPr>
-          <w:lang w:val="en-BE"/>
-        </w:rPr>
+      <w:r>
         <w:pict w14:anchorId="0634A124">
-          <v:rect id="_x0000_i1094" style="width:0;height:1.5pt" o:hralign="center" o:hrstd="t" o:hr="t" fillcolor="#a0a0a0" stroked="f"/>
+          <v:rect id="_x0000_i1028" style="width:0;height:1.5pt" o:hralign="center" o:hrstd="t" o:hr="t" fillcolor="#a0a0a0" stroked="f"/>
         </w:pict>
       </w:r>
     </w:p>
     <w:p>
       <w:pPr>
         <w:pStyle w:val="Heading2"/>
-        <w:rPr>
-          <w:lang w:val="en-BE"/>
-        </w:rPr>
-      </w:pPr>
-      <w:r>
-        <w:rPr>
-          <w:lang w:val="en-BE"/>
-        </w:rPr>
+      </w:pPr>
+      <w:r>
         <w:t>Legal and Data Constraints</w:t>
       </w:r>
     </w:p>
     <w:p>
-      <w:pPr>
-        <w:rPr>
-          <w:lang w:val="en-BE"/>
-        </w:rPr>
-      </w:pPr>
-      <w:r>
-        <w:rPr>
-          <w:lang w:val="en-BE"/>
-        </w:rPr>
+      <w:r>
         <w:t xml:space="preserve">You can only use </w:t>
       </w:r>
       <w:r>
         <w:rPr>
           <w:b/>
           <w:bCs/>
-          <w:lang w:val="en-BE"/>
         </w:rPr>
         <w:t>publicly available content</w:t>
       </w:r>
       <w:r>
-        <w:rPr>
-          <w:lang w:val="en-BE"/>
-        </w:rPr>
         <w:t>.</w:t>
       </w:r>
     </w:p>
     <w:p>
-      <w:pPr>
-        <w:rPr>
-          <w:lang w:val="en-BE"/>
-        </w:rPr>
-      </w:pPr>
-      <w:r>
-        <w:rPr>
-          <w:lang w:val="en-BE"/>
-        </w:rPr>
+      <w:r>
         <w:t>Before collecting anything, take the time to understand:</w:t>
       </w:r>
     </w:p>
@@ -837,14 +472,8 @@
           <w:ilvl w:val="0"/>
           <w:numId w:val="7"/>
         </w:numPr>
-        <w:rPr>
-          <w:lang w:val="en-BE"/>
-        </w:rPr>
-      </w:pPr>
-      <w:r>
-        <w:rPr>
-          <w:lang w:val="en-BE"/>
-        </w:rPr>
+      </w:pPr>
+      <w:r>
         <w:t>what the website allows </w:t>
       </w:r>
     </w:p>
@@ -854,27 +483,14 @@
           <w:ilvl w:val="0"/>
           <w:numId w:val="7"/>
         </w:numPr>
-        <w:rPr>
-          <w:lang w:val="en-BE"/>
-        </w:rPr>
-      </w:pPr>
-      <w:r>
-        <w:rPr>
-          <w:lang w:val="en-BE"/>
-        </w:rPr>
+      </w:pPr>
+      <w:r>
         <w:t>what should be avoided </w:t>
       </w:r>
     </w:p>
     <w:p>
-      <w:pPr>
-        <w:rPr>
-          <w:lang w:val="en-BE"/>
-        </w:rPr>
-      </w:pPr>
-      <w:r>
-        <w:rPr>
-          <w:lang w:val="en-BE"/>
-        </w:rPr>
+      <w:r>
+        <w:lastRenderedPageBreak/>
         <w:t>In practice, this means:</w:t>
       </w:r>
     </w:p>
@@ -884,28 +500,18 @@
           <w:ilvl w:val="0"/>
           <w:numId w:val="8"/>
         </w:numPr>
-        <w:rPr>
-          <w:lang w:val="en-BE"/>
-        </w:rPr>
-      </w:pPr>
-      <w:r>
-        <w:rPr>
-          <w:lang w:val="en-BE"/>
-        </w:rPr>
+      </w:pPr>
+      <w:r>
         <w:t xml:space="preserve">checking </w:t>
       </w:r>
       <w:r>
         <w:rPr>
           <w:b/>
           <w:bCs/>
-          <w:lang w:val="en-BE"/>
         </w:rPr>
         <w:t>robots.txt</w:t>
       </w:r>
       <w:r>
-        <w:rPr>
-          <w:lang w:val="en-BE"/>
-        </w:rPr>
         <w:t> </w:t>
       </w:r>
     </w:p>
@@ -915,41 +521,23 @@
           <w:ilvl w:val="0"/>
           <w:numId w:val="8"/>
         </w:numPr>
-        <w:rPr>
-          <w:lang w:val="en-BE"/>
-        </w:rPr>
-      </w:pPr>
-      <w:r>
-        <w:rPr>
-          <w:lang w:val="en-BE"/>
-        </w:rPr>
+      </w:pPr>
+      <w:r>
         <w:t xml:space="preserve">looking at </w:t>
       </w:r>
       <w:r>
         <w:rPr>
           <w:b/>
           <w:bCs/>
-          <w:lang w:val="en-BE"/>
         </w:rPr>
         <w:t>sitemaps</w:t>
       </w:r>
       <w:r>
-        <w:rPr>
-          <w:lang w:val="en-BE"/>
-        </w:rPr>
         <w:t> </w:t>
       </w:r>
     </w:p>
     <w:p>
-      <w:pPr>
-        <w:rPr>
-          <w:lang w:val="en-BE"/>
-        </w:rPr>
-      </w:pPr>
-      <w:r>
-        <w:rPr>
-          <w:lang w:val="en-BE"/>
-        </w:rPr>
+      <w:r>
         <w:t>Examples:</w:t>
       </w:r>
     </w:p>
@@ -959,23 +547,28 @@
           <w:ilvl w:val="0"/>
           <w:numId w:val="9"/>
         </w:numPr>
-        <w:rPr>
-          <w:lang w:val="en-BE"/>
-        </w:rPr>
       </w:pPr>
       <w:hyperlink r:id="rId8" w:tgtFrame="_blank" w:tooltip="https://www.ing.be/robots.txt" w:history="1">
         <w:r>
           <w:rPr>
             <w:rStyle w:val="Hyperlink"/>
-            <w:lang w:val="en-BE"/>
           </w:rPr>
-          <w:t>https://www.ing.be/robots.txt</w:t>
+          <w:t>https://ww</w:t>
+        </w:r>
+        <w:r>
+          <w:rPr>
+            <w:rStyle w:val="Hyperlink"/>
+          </w:rPr>
+          <w:t>w</w:t>
+        </w:r>
+        <w:r>
+          <w:rPr>
+            <w:rStyle w:val="Hyperlink"/>
+          </w:rPr>
+          <w:t>.ing.be/robots.txt</w:t>
         </w:r>
       </w:hyperlink>
       <w:r>
-        <w:rPr>
-          <w:lang w:val="en-BE"/>
-        </w:rPr>
         <w:t> </w:t>
       </w:r>
     </w:p>
@@ -985,37 +578,36 @@
           <w:ilvl w:val="0"/>
           <w:numId w:val="9"/>
         </w:numPr>
-        <w:rPr>
-          <w:lang w:val="en-BE"/>
-        </w:rPr>
       </w:pPr>
       <w:hyperlink r:id="rId9" w:tgtFrame="_blank" w:tooltip="https://www.ing.be/sitemap-cms.xml" w:history="1">
         <w:r>
           <w:rPr>
             <w:rStyle w:val="Hyperlink"/>
-            <w:lang w:val="en-BE"/>
           </w:rPr>
-          <w:t>https://www.ing.be/sitemap-cms.xml</w:t>
+          <w:t>https://www.ing.be/sitemap</w:t>
+        </w:r>
+        <w:r>
+          <w:rPr>
+            <w:rStyle w:val="Hyperlink"/>
+          </w:rPr>
+          <w:t>-</w:t>
+        </w:r>
+        <w:r>
+          <w:rPr>
+            <w:rStyle w:val="Hyperlink"/>
+          </w:rPr>
+          <w:t>cms.xml</w:t>
         </w:r>
       </w:hyperlink>
       <w:r>
-        <w:rPr>
-          <w:lang w:val="en-BE"/>
-        </w:rPr>
         <w:t> </w:t>
       </w:r>
     </w:p>
     <w:p>
       <w:pPr>
         <w:pStyle w:val="Heading3"/>
-        <w:rPr>
-          <w:lang w:val="en-BE"/>
-        </w:rPr>
-      </w:pPr>
-      <w:r>
-        <w:rPr>
-          <w:lang w:val="en-BE"/>
-        </w:rPr>
+      </w:pPr>
+      <w:r>
         <w:t>Basic rules:</w:t>
       </w:r>
     </w:p>
@@ -1025,14 +617,8 @@
           <w:ilvl w:val="0"/>
           <w:numId w:val="10"/>
         </w:numPr>
-        <w:rPr>
-          <w:lang w:val="en-BE"/>
-        </w:rPr>
-      </w:pPr>
-      <w:r>
-        <w:rPr>
-          <w:lang w:val="en-BE"/>
-        </w:rPr>
+      </w:pPr>
+      <w:r>
         <w:t>do not collect personal data </w:t>
       </w:r>
     </w:p>
@@ -1042,14 +628,8 @@
           <w:ilvl w:val="0"/>
           <w:numId w:val="10"/>
         </w:numPr>
-        <w:rPr>
-          <w:lang w:val="en-BE"/>
-        </w:rPr>
-      </w:pPr>
-      <w:r>
-        <w:rPr>
-          <w:lang w:val="en-BE"/>
-        </w:rPr>
+      </w:pPr>
+      <w:r>
         <w:t>do not try to bypass restrictions </w:t>
       </w:r>
     </w:p>
@@ -1059,109 +639,53 @@
           <w:ilvl w:val="0"/>
           <w:numId w:val="10"/>
         </w:numPr>
-        <w:rPr>
-          <w:lang w:val="en-BE"/>
-        </w:rPr>
-      </w:pPr>
-      <w:r>
-        <w:rPr>
-          <w:lang w:val="en-BE"/>
-        </w:rPr>
+      </w:pPr>
+      <w:r>
         <w:t>work within what is reasonably accessible </w:t>
       </w:r>
     </w:p>
     <w:p>
-      <w:pPr>
-        <w:rPr>
-          <w:lang w:val="en-BE"/>
-        </w:rPr>
-      </w:pPr>
-      <w:r>
-        <w:rPr>
-          <w:lang w:val="en-BE"/>
-        </w:rPr>
+      <w:r>
         <w:t>You should be able to explain:</w:t>
       </w:r>
     </w:p>
     <w:p>
-      <w:pPr>
-        <w:rPr>
-          <w:lang w:val="en-BE"/>
-        </w:rPr>
-      </w:pPr>
-      <w:r>
-        <w:rPr>
-          <w:lang w:val="en-BE"/>
-        </w:rPr>
+      <w:r>
         <w:t>“This is what we considered acceptable, and why.”</w:t>
       </w:r>
     </w:p>
     <w:p>
-      <w:pPr>
-        <w:rPr>
-          <w:lang w:val="en-BE"/>
-        </w:rPr>
-      </w:pPr>
-      <w:r>
-        <w:rPr>
-          <w:lang w:val="en-BE"/>
-        </w:rPr>
+      <w:r>
         <w:pict w14:anchorId="2C16A85D">
-          <v:rect id="_x0000_i1095" style="width:0;height:1.5pt" o:hralign="center" o:hrstd="t" o:hr="t" fillcolor="#a0a0a0" stroked="f"/>
+          <v:rect id="_x0000_i1029" style="width:0;height:1.5pt" o:hralign="center" o:hrstd="t" o:hr="t" fillcolor="#a0a0a0" stroked="f"/>
         </w:pict>
       </w:r>
     </w:p>
     <w:p>
       <w:pPr>
         <w:pStyle w:val="Heading2"/>
-        <w:rPr>
-          <w:lang w:val="en-BE"/>
-        </w:rPr>
-      </w:pPr>
-      <w:r>
-        <w:rPr>
-          <w:lang w:val="en-BE"/>
-        </w:rPr>
+      </w:pPr>
+      <w:r>
         <w:t>Approach — Start Small, Deliver End-to-End</w:t>
       </w:r>
     </w:p>
     <w:p>
-      <w:pPr>
-        <w:rPr>
-          <w:lang w:val="en-BE"/>
-        </w:rPr>
-      </w:pPr>
-      <w:r>
-        <w:rPr>
-          <w:lang w:val="en-BE"/>
-        </w:rPr>
+      <w:r>
         <w:t>It’s easy to get lost trying to analyse everything.</w:t>
       </w:r>
     </w:p>
     <w:p>
-      <w:pPr>
-        <w:rPr>
-          <w:lang w:val="en-BE"/>
-        </w:rPr>
-      </w:pPr>
-      <w:r>
-        <w:rPr>
-          <w:lang w:val="en-BE"/>
-        </w:rPr>
+      <w:r>
         <w:t xml:space="preserve">Instead, aim for a </w:t>
       </w:r>
       <w:r>
         <w:rPr>
           <w:b/>
           <w:bCs/>
-          <w:lang w:val="en-BE"/>
         </w:rPr>
         <w:t>focused and complete piece of work</w:t>
       </w:r>
       <w:r>
-        <w:rPr>
-          <w:lang w:val="en-BE"/>
-        </w:rPr>
         <w:t>:</w:t>
       </w:r>
     </w:p>
@@ -1171,14 +695,8 @@
           <w:ilvl w:val="0"/>
           <w:numId w:val="11"/>
         </w:numPr>
-        <w:rPr>
-          <w:lang w:val="en-BE"/>
-        </w:rPr>
-      </w:pPr>
-      <w:r>
-        <w:rPr>
-          <w:lang w:val="en-BE"/>
-        </w:rPr>
+      </w:pPr>
+      <w:r>
         <w:t>choose a subset of banks and campaigns/pages </w:t>
       </w:r>
     </w:p>
@@ -1188,14 +706,8 @@
           <w:ilvl w:val="0"/>
           <w:numId w:val="11"/>
         </w:numPr>
-        <w:rPr>
-          <w:lang w:val="en-BE"/>
-        </w:rPr>
-      </w:pPr>
-      <w:r>
-        <w:rPr>
-          <w:lang w:val="en-BE"/>
-        </w:rPr>
+      </w:pPr>
+      <w:r>
         <w:t>analyse them properly from start to finish </w:t>
       </w:r>
     </w:p>
@@ -1205,116 +717,61 @@
           <w:ilvl w:val="0"/>
           <w:numId w:val="11"/>
         </w:numPr>
-        <w:rPr>
-          <w:lang w:val="en-BE"/>
-        </w:rPr>
-      </w:pPr>
-      <w:r>
-        <w:rPr>
-          <w:lang w:val="en-BE"/>
-        </w:rPr>
+      </w:pPr>
+      <w:r>
         <w:t xml:space="preserve">be explicit about what you did </w:t>
       </w:r>
       <w:r>
         <w:rPr>
           <w:i/>
           <w:iCs/>
-          <w:lang w:val="en-BE"/>
         </w:rPr>
         <w:t>not</w:t>
       </w:r>
       <w:r>
-        <w:rPr>
-          <w:lang w:val="en-BE"/>
-        </w:rPr>
         <w:t xml:space="preserve"> include and why </w:t>
       </w:r>
     </w:p>
     <w:p>
-      <w:pPr>
-        <w:rPr>
-          <w:lang w:val="en-BE"/>
-        </w:rPr>
-      </w:pPr>
-      <w:r>
-        <w:rPr>
-          <w:lang w:val="en-BE"/>
-        </w:rPr>
+      <w:r>
         <w:t xml:space="preserve">This is your </w:t>
       </w:r>
       <w:r>
         <w:rPr>
           <w:b/>
           <w:bCs/>
-          <w:lang w:val="en-BE"/>
         </w:rPr>
         <w:t>MVP (Minimum Viable Product)</w:t>
       </w:r>
       <w:r>
-        <w:rPr>
-          <w:lang w:val="en-BE"/>
-        </w:rPr>
         <w:t>:</w:t>
       </w:r>
     </w:p>
     <w:p>
-      <w:pPr>
-        <w:rPr>
-          <w:lang w:val="en-BE"/>
-        </w:rPr>
-      </w:pPr>
-      <w:r>
-        <w:rPr>
-          <w:lang w:val="en-BE"/>
-        </w:rPr>
+      <w:r>
         <w:t>a working, coherent analysis on a limited scope</w:t>
       </w:r>
     </w:p>
     <w:p>
-      <w:pPr>
-        <w:rPr>
-          <w:lang w:val="en-BE"/>
-        </w:rPr>
-      </w:pPr>
-      <w:r>
-        <w:rPr>
-          <w:lang w:val="en-BE"/>
-        </w:rPr>
+      <w:r>
         <w:pict w14:anchorId="7C45B9CB">
-          <v:rect id="_x0000_i1096" style="width:0;height:1.5pt" o:hralign="center" o:hrstd="t" o:hr="t" fillcolor="#a0a0a0" stroked="f"/>
+          <v:rect id="_x0000_i1030" style="width:0;height:1.5pt" o:hralign="center" o:hrstd="t" o:hr="t" fillcolor="#a0a0a0" stroked="f"/>
         </w:pict>
       </w:r>
     </w:p>
     <w:p>
       <w:pPr>
         <w:pStyle w:val="Heading2"/>
-        <w:rPr>
-          <w:lang w:val="en-BE"/>
-        </w:rPr>
-      </w:pPr>
-      <w:r>
-        <w:rPr>
-          <w:lang w:val="en-BE"/>
-        </w:rPr>
+      </w:pPr>
+      <w:r>
         <w:t>How to Analyse Campaigns</w:t>
       </w:r>
     </w:p>
     <w:p>
-      <w:pPr>
-        <w:rPr>
-          <w:lang w:val="en-BE"/>
-        </w:rPr>
-      </w:pPr>
-      <w:r>
-        <w:rPr>
-          <w:lang w:val="en-BE"/>
-        </w:rPr>
+      <w:r>
         <w:t>Think of campaigns as a combination of content and design.</w:t>
       </w:r>
       <w:r>
-        <w:rPr>
-          <w:lang w:val="en-BE"/>
-        </w:rPr>
         <w:br/>
         <w:t>You can structure your analysis around dimensions such as:</w:t>
       </w:r>
@@ -1325,22 +782,15 @@
           <w:ilvl w:val="0"/>
           <w:numId w:val="12"/>
         </w:numPr>
-        <w:rPr>
-          <w:lang w:val="en-BE"/>
-        </w:rPr>
       </w:pPr>
       <w:r>
         <w:rPr>
           <w:b/>
           <w:bCs/>
-          <w:lang w:val="en-BE"/>
         </w:rPr>
         <w:t>Tone &amp; messaging</w:t>
       </w:r>
       <w:r>
-        <w:rPr>
-          <w:lang w:val="en-BE"/>
-        </w:rPr>
         <w:t>:  Is it formal, simple, persuasive? </w:t>
       </w:r>
     </w:p>
@@ -1350,22 +800,15 @@
           <w:ilvl w:val="0"/>
           <w:numId w:val="12"/>
         </w:numPr>
-        <w:rPr>
-          <w:lang w:val="en-BE"/>
-        </w:rPr>
       </w:pPr>
       <w:r>
         <w:rPr>
           <w:b/>
           <w:bCs/>
-          <w:lang w:val="en-BE"/>
         </w:rPr>
         <w:t>Visuals &amp; illustrations</w:t>
       </w:r>
       <w:r>
-        <w:rPr>
-          <w:lang w:val="en-BE"/>
-        </w:rPr>
         <w:t>:  What kind of images are used? What do they show? </w:t>
       </w:r>
     </w:p>
@@ -1375,22 +818,15 @@
           <w:ilvl w:val="0"/>
           <w:numId w:val="12"/>
         </w:numPr>
-        <w:rPr>
-          <w:lang w:val="en-BE"/>
-        </w:rPr>
       </w:pPr>
       <w:r>
         <w:rPr>
           <w:b/>
           <w:bCs/>
-          <w:lang w:val="en-BE"/>
         </w:rPr>
         <w:t>Colours &amp; design</w:t>
       </w:r>
       <w:r>
-        <w:rPr>
-          <w:lang w:val="en-BE"/>
-        </w:rPr>
         <w:t>:  How is attention guided? What stands out?  </w:t>
       </w:r>
     </w:p>
@@ -1400,22 +836,16 @@
           <w:ilvl w:val="0"/>
           <w:numId w:val="12"/>
         </w:numPr>
-        <w:rPr>
-          <w:lang w:val="en-BE"/>
-        </w:rPr>
       </w:pPr>
       <w:r>
         <w:rPr>
           <w:b/>
           <w:bCs/>
-          <w:lang w:val="en-BE"/>
-        </w:rPr>
+        </w:rPr>
+        <w:lastRenderedPageBreak/>
         <w:t>Layout &amp; structure</w:t>
       </w:r>
       <w:r>
-        <w:rPr>
-          <w:lang w:val="en-BE"/>
-        </w:rPr>
         <w:t>: Is the page easy to read? How is it organised? </w:t>
       </w:r>
     </w:p>
@@ -1425,105 +855,60 @@
           <w:ilvl w:val="0"/>
           <w:numId w:val="12"/>
         </w:numPr>
-        <w:rPr>
-          <w:lang w:val="en-BE"/>
-        </w:rPr>
       </w:pPr>
       <w:r>
         <w:rPr>
           <w:b/>
           <w:bCs/>
-          <w:lang w:val="en-BE"/>
         </w:rPr>
         <w:t>Topics &amp; value proposition</w:t>
       </w:r>
       <w:r>
-        <w:rPr>
-          <w:lang w:val="en-BE"/>
-        </w:rPr>
         <w:t>:  What is being offered? How is it framed? </w:t>
       </w:r>
     </w:p>
     <w:p>
-      <w:pPr>
-        <w:rPr>
-          <w:lang w:val="en-BE"/>
-        </w:rPr>
-      </w:pPr>
-      <w:r>
-        <w:rPr>
-          <w:lang w:val="en-BE"/>
-        </w:rPr>
+      <w:r>
         <w:t xml:space="preserve">The goal is not just to describe, but to </w:t>
       </w:r>
       <w:r>
         <w:rPr>
           <w:b/>
           <w:bCs/>
-          <w:lang w:val="en-BE"/>
         </w:rPr>
         <w:t>compare consistently across banks</w:t>
       </w:r>
       <w:r>
-        <w:rPr>
-          <w:lang w:val="en-BE"/>
-        </w:rPr>
         <w:t>.</w:t>
       </w:r>
     </w:p>
     <w:p>
-      <w:pPr>
-        <w:rPr>
-          <w:lang w:val="en-BE"/>
-        </w:rPr>
-      </w:pPr>
-      <w:r>
-        <w:rPr>
-          <w:lang w:val="en-BE"/>
-        </w:rPr>
+      <w:r>
         <w:pict w14:anchorId="19F5A1ED">
-          <v:rect id="_x0000_i1097" style="width:0;height:1.5pt" o:hralign="center" o:hrstd="t" o:hr="t" fillcolor="#a0a0a0" stroked="f"/>
+          <v:rect id="_x0000_i1031" style="width:0;height:1.5pt" o:hralign="center" o:hrstd="t" o:hr="t" fillcolor="#a0a0a0" stroked="f"/>
         </w:pict>
       </w:r>
     </w:p>
     <w:p>
       <w:pPr>
         <w:pStyle w:val="Heading2"/>
-        <w:rPr>
-          <w:lang w:val="en-BE"/>
-        </w:rPr>
-      </w:pPr>
-      <w:r>
-        <w:rPr>
-          <w:lang w:val="en-BE"/>
-        </w:rPr>
+      </w:pPr>
+      <w:r>
         <w:t>Feature Extraction</w:t>
       </w:r>
     </w:p>
     <w:p>
-      <w:pPr>
-        <w:rPr>
-          <w:lang w:val="en-BE"/>
-        </w:rPr>
-      </w:pPr>
-      <w:r>
-        <w:rPr>
-          <w:lang w:val="en-BE"/>
-        </w:rPr>
+      <w:r>
         <w:t xml:space="preserve">For each campaign/page, you should build a </w:t>
       </w:r>
       <w:r>
         <w:rPr>
           <w:b/>
           <w:bCs/>
-          <w:lang w:val="en-BE"/>
         </w:rPr>
         <w:t>structured description</w:t>
       </w:r>
       <w:r>
-        <w:rPr>
-          <w:lang w:val="en-BE"/>
-        </w:rPr>
         <w:t>:</w:t>
       </w:r>
     </w:p>
@@ -1533,14 +918,8 @@
           <w:ilvl w:val="0"/>
           <w:numId w:val="13"/>
         </w:numPr>
-        <w:rPr>
-          <w:lang w:val="en-BE"/>
-        </w:rPr>
-      </w:pPr>
-      <w:r>
-        <w:rPr>
-          <w:lang w:val="en-BE"/>
-        </w:rPr>
+      </w:pPr>
+      <w:r>
         <w:t>define measurable or categorical features </w:t>
       </w:r>
     </w:p>
@@ -1550,27 +929,13 @@
           <w:ilvl w:val="0"/>
           <w:numId w:val="13"/>
         </w:numPr>
-        <w:rPr>
-          <w:lang w:val="en-BE"/>
-        </w:rPr>
-      </w:pPr>
-      <w:r>
-        <w:rPr>
-          <w:lang w:val="en-BE"/>
-        </w:rPr>
+      </w:pPr>
+      <w:r>
         <w:t>keep them consistent across banks </w:t>
       </w:r>
     </w:p>
     <w:p>
-      <w:pPr>
-        <w:rPr>
-          <w:lang w:val="en-BE"/>
-        </w:rPr>
-      </w:pPr>
-      <w:r>
-        <w:rPr>
-          <w:lang w:val="en-BE"/>
-        </w:rPr>
+      <w:r>
         <w:t>This will allow you to:</w:t>
       </w:r>
     </w:p>
@@ -1580,14 +945,8 @@
           <w:ilvl w:val="0"/>
           <w:numId w:val="14"/>
         </w:numPr>
-        <w:rPr>
-          <w:lang w:val="en-BE"/>
-        </w:rPr>
-      </w:pPr>
-      <w:r>
-        <w:rPr>
-          <w:lang w:val="en-BE"/>
-        </w:rPr>
+      </w:pPr>
+      <w:r>
         <w:t>compare campaigns in a more objective way </w:t>
       </w:r>
     </w:p>
@@ -1597,63 +956,32 @@
           <w:ilvl w:val="0"/>
           <w:numId w:val="14"/>
         </w:numPr>
-        <w:rPr>
-          <w:lang w:val="en-BE"/>
-        </w:rPr>
-      </w:pPr>
-      <w:r>
-        <w:rPr>
-          <w:lang w:val="en-BE"/>
-        </w:rPr>
+      </w:pPr>
+      <w:r>
         <w:t>create something that could be reused later </w:t>
       </w:r>
       <w:r>
-        <w:rPr>
-          <w:lang w:val="en-BE"/>
-        </w:rPr>
         <w:br/>
         <w:t>Think of it as turning a webpage into a small dataset.  </w:t>
       </w:r>
     </w:p>
     <w:p>
-      <w:pPr>
-        <w:rPr>
-          <w:lang w:val="en-BE"/>
-        </w:rPr>
-      </w:pPr>
-      <w:r>
-        <w:rPr>
-          <w:lang w:val="en-BE"/>
-        </w:rPr>
+      <w:r>
         <w:pict w14:anchorId="7F51BA44">
-          <v:rect id="_x0000_i1098" style="width:0;height:1.5pt" o:hralign="center" o:hrstd="t" o:hr="t" fillcolor="#a0a0a0" stroked="f"/>
+          <v:rect id="_x0000_i1032" style="width:0;height:1.5pt" o:hralign="center" o:hrstd="t" o:hr="t" fillcolor="#a0a0a0" stroked="f"/>
         </w:pict>
       </w:r>
     </w:p>
     <w:p>
       <w:pPr>
         <w:pStyle w:val="Heading2"/>
-        <w:rPr>
-          <w:lang w:val="en-BE"/>
-        </w:rPr>
-      </w:pPr>
-      <w:r>
-        <w:rPr>
-          <w:lang w:val="en-BE"/>
-        </w:rPr>
+      </w:pPr>
+      <w:r>
         <w:t>Expected Outputs</w:t>
       </w:r>
     </w:p>
     <w:p>
-      <w:pPr>
-        <w:rPr>
-          <w:lang w:val="en-BE"/>
-        </w:rPr>
-      </w:pPr>
-      <w:r>
-        <w:rPr>
-          <w:lang w:val="en-BE"/>
-        </w:rPr>
+      <w:r>
         <w:t>You should deliver:</w:t>
       </w:r>
     </w:p>
@@ -1663,28 +991,18 @@
           <w:ilvl w:val="0"/>
           <w:numId w:val="15"/>
         </w:numPr>
-        <w:rPr>
-          <w:lang w:val="en-BE"/>
-        </w:rPr>
-      </w:pPr>
-      <w:r>
-        <w:rPr>
-          <w:lang w:val="en-BE"/>
-        </w:rPr>
+      </w:pPr>
+      <w:r>
         <w:t xml:space="preserve">a </w:t>
       </w:r>
       <w:r>
         <w:rPr>
           <w:b/>
           <w:bCs/>
-          <w:lang w:val="en-BE"/>
         </w:rPr>
         <w:t>clear comparison</w:t>
       </w:r>
       <w:r>
-        <w:rPr>
-          <w:lang w:val="en-BE"/>
-        </w:rPr>
         <w:t xml:space="preserve"> between selected banks </w:t>
       </w:r>
     </w:p>
@@ -1694,14 +1012,8 @@
           <w:ilvl w:val="0"/>
           <w:numId w:val="15"/>
         </w:numPr>
-        <w:rPr>
-          <w:lang w:val="en-BE"/>
-        </w:rPr>
-      </w:pPr>
-      <w:r>
-        <w:rPr>
-          <w:lang w:val="en-BE"/>
-        </w:rPr>
+      </w:pPr>
+      <w:r>
         <w:t>a view of how ING is positioned </w:t>
       </w:r>
     </w:p>
@@ -1711,14 +1023,8 @@
           <w:ilvl w:val="0"/>
           <w:numId w:val="15"/>
         </w:numPr>
-        <w:rPr>
-          <w:lang w:val="en-BE"/>
-        </w:rPr>
-      </w:pPr>
-      <w:r>
-        <w:rPr>
-          <w:lang w:val="en-BE"/>
-        </w:rPr>
+      </w:pPr>
+      <w:r>
         <w:t>identified similarities and differences </w:t>
       </w:r>
     </w:p>
@@ -1728,41 +1034,23 @@
           <w:ilvl w:val="0"/>
           <w:numId w:val="15"/>
         </w:numPr>
-        <w:rPr>
-          <w:lang w:val="en-BE"/>
-        </w:rPr>
-      </w:pPr>
-      <w:r>
-        <w:rPr>
-          <w:lang w:val="en-BE"/>
-        </w:rPr>
+      </w:pPr>
+      <w:r>
         <w:t xml:space="preserve">a few </w:t>
       </w:r>
       <w:r>
         <w:rPr>
           <w:b/>
           <w:bCs/>
-          <w:lang w:val="en-BE"/>
         </w:rPr>
         <w:t>well-argued insights or improvement ideas</w:t>
       </w:r>
       <w:r>
-        <w:rPr>
-          <w:lang w:val="en-BE"/>
-        </w:rPr>
         <w:t>   </w:t>
       </w:r>
     </w:p>
     <w:p>
-      <w:pPr>
-        <w:rPr>
-          <w:lang w:val="en-BE"/>
-        </w:rPr>
-      </w:pPr>
-      <w:r>
-        <w:rPr>
-          <w:lang w:val="en-BE"/>
-        </w:rPr>
+      <w:r>
         <w:t>You will also present your work to two types of stakeholders:</w:t>
       </w:r>
     </w:p>
@@ -1772,28 +1060,18 @@
           <w:ilvl w:val="0"/>
           <w:numId w:val="16"/>
         </w:numPr>
-        <w:rPr>
-          <w:lang w:val="en-BE"/>
-        </w:rPr>
       </w:pPr>
       <w:r>
         <w:rPr>
           <w:b/>
           <w:bCs/>
-          <w:lang w:val="en-BE"/>
         </w:rPr>
         <w:t>Business audience</w:t>
       </w:r>
       <w:r>
-        <w:rPr>
-          <w:lang w:val="en-BE"/>
-        </w:rPr>
         <w:t> </w:t>
       </w:r>
       <w:r>
-        <w:rPr>
-          <w:lang w:val="en-BE"/>
-        </w:rPr>
         <w:br/>
         <w:t>→ what does this mean for ING? </w:t>
       </w:r>
@@ -1804,84 +1082,44 @@
           <w:ilvl w:val="0"/>
           <w:numId w:val="16"/>
         </w:numPr>
-        <w:rPr>
-          <w:lang w:val="en-BE"/>
-        </w:rPr>
       </w:pPr>
       <w:r>
         <w:rPr>
           <w:b/>
           <w:bCs/>
-          <w:lang w:val="en-BE"/>
         </w:rPr>
         <w:t>Data audience</w:t>
       </w:r>
       <w:r>
-        <w:rPr>
-          <w:lang w:val="en-BE"/>
-        </w:rPr>
         <w:t> </w:t>
       </w:r>
       <w:r>
-        <w:rPr>
-          <w:lang w:val="en-BE"/>
-        </w:rPr>
         <w:br/>
         <w:t>→ how did you approach the problem? what are the limitations? </w:t>
       </w:r>
     </w:p>
     <w:p>
-      <w:pPr>
-        <w:rPr>
-          <w:lang w:val="en-BE"/>
-        </w:rPr>
-      </w:pPr>
-      <w:r>
-        <w:rPr>
-          <w:lang w:val="en-BE"/>
-        </w:rPr>
+      <w:r>
         <w:pict w14:anchorId="7D63B33E">
-          <v:rect id="_x0000_i1099" style="width:0;height:1.5pt" o:hralign="center" o:hrstd="t" o:hr="t" fillcolor="#a0a0a0" stroked="f"/>
+          <v:rect id="_x0000_i1033" style="width:0;height:1.5pt" o:hralign="center" o:hrstd="t" o:hr="t" fillcolor="#a0a0a0" stroked="f"/>
         </w:pict>
       </w:r>
     </w:p>
     <w:p>
       <w:pPr>
         <w:pStyle w:val="Heading2"/>
-        <w:rPr>
-          <w:lang w:val="en-BE"/>
-        </w:rPr>
-      </w:pPr>
-      <w:r>
-        <w:rPr>
-          <w:lang w:val="en-BE"/>
-        </w:rPr>
+      </w:pPr>
+      <w:r>
         <w:t>Why This Matters</w:t>
       </w:r>
     </w:p>
     <w:p>
-      <w:pPr>
-        <w:rPr>
-          <w:lang w:val="en-BE"/>
-        </w:rPr>
-      </w:pPr>
-      <w:r>
-        <w:rPr>
-          <w:lang w:val="en-BE"/>
-        </w:rPr>
+      <w:r>
         <w:t>This project is just a starting point.</w:t>
       </w:r>
     </w:p>
     <w:p>
-      <w:pPr>
-        <w:rPr>
-          <w:lang w:val="en-BE"/>
-        </w:rPr>
-      </w:pPr>
-      <w:r>
-        <w:rPr>
-          <w:lang w:val="en-BE"/>
-        </w:rPr>
+      <w:r>
         <w:t>If done properly, what you build could be extended to:</w:t>
       </w:r>
     </w:p>
@@ -1891,14 +1129,8 @@
           <w:ilvl w:val="0"/>
           <w:numId w:val="17"/>
         </w:numPr>
-        <w:rPr>
-          <w:lang w:val="en-BE"/>
-        </w:rPr>
-      </w:pPr>
-      <w:r>
-        <w:rPr>
-          <w:lang w:val="en-BE"/>
-        </w:rPr>
+      </w:pPr>
+      <w:r>
         <w:t>social media campaigns </w:t>
       </w:r>
     </w:p>
@@ -1908,14 +1140,9 @@
           <w:ilvl w:val="0"/>
           <w:numId w:val="17"/>
         </w:numPr>
-        <w:rPr>
-          <w:lang w:val="en-BE"/>
-        </w:rPr>
-      </w:pPr>
-      <w:r>
-        <w:rPr>
-          <w:lang w:val="en-BE"/>
-        </w:rPr>
+      </w:pPr>
+      <w:r>
+        <w:lastRenderedPageBreak/>
         <w:t>banners in web or mobile apps </w:t>
       </w:r>
     </w:p>
@@ -1925,56 +1152,28 @@
           <w:ilvl w:val="0"/>
           <w:numId w:val="17"/>
         </w:numPr>
-        <w:rPr>
-          <w:lang w:val="en-BE"/>
-        </w:rPr>
-      </w:pPr>
-      <w:r>
-        <w:rPr>
-          <w:lang w:val="en-BE"/>
-        </w:rPr>
+      </w:pPr>
+      <w:r>
         <w:t>larger-scale automated analysis   </w:t>
       </w:r>
     </w:p>
     <w:p>
-      <w:pPr>
-        <w:rPr>
-          <w:lang w:val="en-BE"/>
-        </w:rPr>
-      </w:pPr>
-      <w:r>
-        <w:rPr>
-          <w:lang w:val="en-BE"/>
-        </w:rPr>
+      <w:r>
         <w:t>The feature framework you define could later serve as input to more advanced models.</w:t>
       </w:r>
     </w:p>
     <w:p>
-      <w:pPr>
-        <w:rPr>
-          <w:lang w:val="en-BE"/>
-        </w:rPr>
-      </w:pPr>
-      <w:r>
-        <w:rPr>
-          <w:lang w:val="en-BE"/>
-        </w:rPr>
+      <w:r>
         <w:pict w14:anchorId="74E04B21">
-          <v:rect id="_x0000_i1100" style="width:0;height:1.5pt" o:hralign="center" o:hrstd="t" o:hr="t" fillcolor="#a0a0a0" stroked="f"/>
+          <v:rect id="_x0000_i1034" style="width:0;height:1.5pt" o:hralign="center" o:hrstd="t" o:hr="t" fillcolor="#a0a0a0" stroked="f"/>
         </w:pict>
       </w:r>
     </w:p>
     <w:p>
       <w:pPr>
         <w:pStyle w:val="Heading2"/>
-        <w:rPr>
-          <w:lang w:val="en-BE"/>
-        </w:rPr>
-      </w:pPr>
-      <w:r>
-        <w:rPr>
-          <w:lang w:val="en-BE"/>
-        </w:rPr>
+      </w:pPr>
+      <w:r>
         <w:t>Mindset</w:t>
       </w:r>
     </w:p>
@@ -1984,14 +1183,8 @@
           <w:ilvl w:val="0"/>
           <w:numId w:val="18"/>
         </w:numPr>
-        <w:rPr>
-          <w:lang w:val="en-BE"/>
-        </w:rPr>
-      </w:pPr>
-      <w:r>
-        <w:rPr>
-          <w:lang w:val="en-BE"/>
-        </w:rPr>
+      </w:pPr>
+      <w:r>
         <w:t>Be pragmatic </w:t>
       </w:r>
     </w:p>
@@ -2001,14 +1194,8 @@
           <w:ilvl w:val="0"/>
           <w:numId w:val="18"/>
         </w:numPr>
-        <w:rPr>
-          <w:lang w:val="en-BE"/>
-        </w:rPr>
-      </w:pPr>
-      <w:r>
-        <w:rPr>
-          <w:lang w:val="en-BE"/>
-        </w:rPr>
+      </w:pPr>
+      <w:r>
         <w:t>Make clear choices and explain them </w:t>
       </w:r>
     </w:p>
@@ -2018,14 +1205,8 @@
           <w:ilvl w:val="0"/>
           <w:numId w:val="18"/>
         </w:numPr>
-        <w:rPr>
-          <w:lang w:val="en-BE"/>
-        </w:rPr>
-      </w:pPr>
-      <w:r>
-        <w:rPr>
-          <w:lang w:val="en-BE"/>
-        </w:rPr>
+      </w:pPr>
+      <w:r>
         <w:t>Accept that your analysis will be imperfect </w:t>
       </w:r>
     </w:p>
@@ -2035,56 +1216,28 @@
           <w:ilvl w:val="0"/>
           <w:numId w:val="18"/>
         </w:numPr>
-        <w:rPr>
-          <w:lang w:val="en-BE"/>
-        </w:rPr>
-      </w:pPr>
-      <w:r>
-        <w:rPr>
-          <w:lang w:val="en-BE"/>
-        </w:rPr>
+      </w:pPr>
+      <w:r>
         <w:t>Focus on delivering something coherent and usable </w:t>
       </w:r>
     </w:p>
     <w:p>
-      <w:pPr>
-        <w:rPr>
-          <w:lang w:val="en-BE"/>
-        </w:rPr>
-      </w:pPr>
-      <w:r>
-        <w:rPr>
-          <w:lang w:val="en-BE"/>
-        </w:rPr>
+      <w:r>
         <w:pict w14:anchorId="5BAF29B2">
-          <v:rect id="_x0000_i1101" style="width:0;height:1.5pt" o:hralign="center" o:hrstd="t" o:hr="t" fillcolor="#a0a0a0" stroked="f"/>
+          <v:rect id="_x0000_i1035" style="width:0;height:1.5pt" o:hralign="center" o:hrstd="t" o:hr="t" fillcolor="#a0a0a0" stroked="f"/>
         </w:pict>
       </w:r>
     </w:p>
     <w:p>
       <w:pPr>
         <w:pStyle w:val="Heading2"/>
-        <w:rPr>
-          <w:lang w:val="en-BE"/>
-        </w:rPr>
-      </w:pPr>
-      <w:r>
-        <w:rPr>
-          <w:lang w:val="en-BE"/>
-        </w:rPr>
+      </w:pPr>
+      <w:r>
         <w:t>Goal</w:t>
       </w:r>
     </w:p>
     <w:p>
-      <w:pPr>
-        <w:rPr>
-          <w:lang w:val="en-BE"/>
-        </w:rPr>
-      </w:pPr>
-      <w:r>
-        <w:rPr>
-          <w:lang w:val="en-BE"/>
-        </w:rPr>
+      <w:r>
         <w:t>By the end of this project, you should have:</w:t>
       </w:r>
     </w:p>
@@ -2094,14 +1247,8 @@
           <w:ilvl w:val="0"/>
           <w:numId w:val="19"/>
         </w:numPr>
-        <w:rPr>
-          <w:lang w:val="en-BE"/>
-        </w:rPr>
-      </w:pPr>
-      <w:r>
-        <w:rPr>
-          <w:lang w:val="en-BE"/>
-        </w:rPr>
+      </w:pPr>
+      <w:r>
         <w:t>a grounded view of how ING compares to other banks </w:t>
       </w:r>
     </w:p>
@@ -2111,14 +1258,8 @@
           <w:ilvl w:val="0"/>
           <w:numId w:val="19"/>
         </w:numPr>
-        <w:rPr>
-          <w:lang w:val="en-BE"/>
-        </w:rPr>
-      </w:pPr>
-      <w:r>
-        <w:rPr>
-          <w:lang w:val="en-BE"/>
-        </w:rPr>
+      </w:pPr>
+      <w:r>
         <w:t>a structured way to describe marketing campaigns </w:t>
       </w:r>
     </w:p>
@@ -2128,21 +1269,1060 @@
           <w:ilvl w:val="0"/>
           <w:numId w:val="19"/>
         </w:numPr>
-        <w:rPr>
-          <w:lang w:val="en-BE"/>
-        </w:rPr>
-      </w:pPr>
-      <w:r>
-        <w:rPr>
-          <w:lang w:val="en-BE"/>
-        </w:rPr>
+      </w:pPr>
+      <w:r>
         <w:t>a first step towards something that could scale beyond this exercise</w:t>
       </w:r>
     </w:p>
     <w:p>
-      <w:pPr>
-        <w:rPr>
-          <w:lang w:val="en-BE"/>
+      <w:r>
+        <w:br w:type="page"/>
+      </w:r>
+    </w:p>
+    <w:p>
+      <w:pPr>
+        <w:rPr>
+          <w:lang w:val="fr-BE"/>
+        </w:rPr>
+      </w:pPr>
+      <w:proofErr w:type="gramStart"/>
+      <w:r>
+        <w:rPr>
+          <w:lang w:val="fr-BE"/>
+        </w:rPr>
+        <w:lastRenderedPageBreak/>
+        <w:t>lu</w:t>
+      </w:r>
+      <w:proofErr w:type="gramEnd"/>
+      <w:r>
+        <w:rPr>
+          <w:lang w:val="fr-BE"/>
+        </w:rPr>
+        <w:t xml:space="preserve"> — les deux documents (14/09). </w:t>
+      </w:r>
+      <w:proofErr w:type="gramStart"/>
+      <w:r>
+        <w:rPr>
+          <w:lang w:val="fr-BE"/>
+        </w:rPr>
+        <w:t>ça</w:t>
+      </w:r>
+      <w:proofErr w:type="gramEnd"/>
+      <w:r>
+        <w:rPr>
+          <w:lang w:val="fr-BE"/>
+        </w:rPr>
+        <w:t xml:space="preserve"> clarifie et corrige pas mal de choses par rapport à ce qu'on avait supposé oralement :</w:t>
+      </w:r>
+    </w:p>
+    <w:p>
+      <w:pPr>
+        <w:rPr>
+          <w:lang w:val="fr-BE"/>
+        </w:rPr>
+      </w:pPr>
+      <w:proofErr w:type="gramStart"/>
+      <w:r>
+        <w:rPr>
+          <w:b/>
+          <w:bCs/>
+          <w:lang w:val="fr-BE"/>
+        </w:rPr>
+        <w:t>ce</w:t>
+      </w:r>
+      <w:proofErr w:type="gramEnd"/>
+      <w:r>
+        <w:rPr>
+          <w:b/>
+          <w:bCs/>
+          <w:lang w:val="fr-BE"/>
+        </w:rPr>
+        <w:t xml:space="preserve"> qui change concrètement</w:t>
+      </w:r>
+    </w:p>
+    <w:p>
+      <w:pPr>
+        <w:numPr>
+          <w:ilvl w:val="0"/>
+          <w:numId w:val="20"/>
+        </w:numPr>
+        <w:rPr>
+          <w:lang w:val="fr-BE"/>
+        </w:rPr>
+      </w:pPr>
+      <w:proofErr w:type="gramStart"/>
+      <w:r>
+        <w:rPr>
+          <w:lang w:val="fr-BE"/>
+        </w:rPr>
+        <w:t>ce</w:t>
+      </w:r>
+      <w:proofErr w:type="gramEnd"/>
+      <w:r>
+        <w:rPr>
+          <w:lang w:val="fr-BE"/>
+        </w:rPr>
+        <w:t xml:space="preserve"> n'est </w:t>
+      </w:r>
+      <w:r>
+        <w:rPr>
+          <w:b/>
+          <w:bCs/>
+          <w:lang w:val="fr-BE"/>
+        </w:rPr>
+        <w:t>pas</w:t>
+      </w:r>
+      <w:r>
+        <w:rPr>
+          <w:lang w:val="fr-BE"/>
+        </w:rPr>
+        <w:t xml:space="preserve"> "tous les canaux" (</w:t>
+      </w:r>
+      <w:proofErr w:type="spellStart"/>
+      <w:r>
+        <w:rPr>
+          <w:lang w:val="fr-BE"/>
+        </w:rPr>
+        <w:t>site+réseaux+pub+presse+rapports</w:t>
+      </w:r>
+      <w:proofErr w:type="spellEnd"/>
+      <w:r>
+        <w:rPr>
+          <w:lang w:val="fr-BE"/>
+        </w:rPr>
+        <w:t xml:space="preserve"> annuels) — le brief officiel parle de </w:t>
+      </w:r>
+      <w:r>
+        <w:rPr>
+          <w:b/>
+          <w:bCs/>
+          <w:lang w:val="fr-BE"/>
+        </w:rPr>
+        <w:t>campagnes en ligne</w:t>
+      </w:r>
+      <w:r>
+        <w:rPr>
+          <w:lang w:val="fr-BE"/>
+        </w:rPr>
+        <w:t xml:space="preserve"> spécifiquement (pages/</w:t>
+      </w:r>
+      <w:proofErr w:type="spellStart"/>
+      <w:r>
+        <w:rPr>
+          <w:lang w:val="fr-BE"/>
+        </w:rPr>
+        <w:t>campaigns</w:t>
+      </w:r>
+      <w:proofErr w:type="spellEnd"/>
+      <w:r>
+        <w:rPr>
+          <w:lang w:val="fr-BE"/>
+        </w:rPr>
+        <w:t xml:space="preserve"> web), pas du dispositif de communication complet. </w:t>
+      </w:r>
+      <w:proofErr w:type="gramStart"/>
+      <w:r>
+        <w:rPr>
+          <w:lang w:val="fr-BE"/>
+        </w:rPr>
+        <w:t>mon</w:t>
+      </w:r>
+      <w:proofErr w:type="gramEnd"/>
+      <w:r>
+        <w:rPr>
+          <w:lang w:val="fr-BE"/>
+        </w:rPr>
+        <w:t xml:space="preserve"> plan précédent était trop large.</w:t>
+      </w:r>
+    </w:p>
+    <w:p>
+      <w:pPr>
+        <w:numPr>
+          <w:ilvl w:val="0"/>
+          <w:numId w:val="20"/>
+        </w:numPr>
+        <w:rPr>
+          <w:lang w:val="fr-BE"/>
+        </w:rPr>
+      </w:pPr>
+      <w:proofErr w:type="gramStart"/>
+      <w:r>
+        <w:rPr>
+          <w:lang w:val="fr-BE"/>
+        </w:rPr>
+        <w:t>banques</w:t>
+      </w:r>
+      <w:proofErr w:type="gramEnd"/>
+      <w:r>
+        <w:rPr>
+          <w:lang w:val="fr-BE"/>
+        </w:rPr>
+        <w:t xml:space="preserve"> nommées par le brief : traditionnelles = ING, KBC, BNP Paribas Fortis, Argenta, </w:t>
+      </w:r>
+      <w:proofErr w:type="spellStart"/>
+      <w:r>
+        <w:rPr>
+          <w:lang w:val="fr-BE"/>
+        </w:rPr>
+        <w:t>Crelan</w:t>
+      </w:r>
+      <w:proofErr w:type="spellEnd"/>
+      <w:r>
+        <w:rPr>
+          <w:lang w:val="fr-BE"/>
+        </w:rPr>
+        <w:t xml:space="preserve"> ; </w:t>
+      </w:r>
+      <w:proofErr w:type="spellStart"/>
+      <w:r>
+        <w:rPr>
+          <w:lang w:val="fr-BE"/>
+        </w:rPr>
+        <w:t>neobanques</w:t>
+      </w:r>
+      <w:proofErr w:type="spellEnd"/>
+      <w:r>
+        <w:rPr>
+          <w:lang w:val="fr-BE"/>
+        </w:rPr>
+        <w:t xml:space="preserve"> = </w:t>
+      </w:r>
+      <w:proofErr w:type="spellStart"/>
+      <w:r>
+        <w:rPr>
+          <w:lang w:val="fr-BE"/>
+        </w:rPr>
+        <w:t>Revolut</w:t>
+      </w:r>
+      <w:proofErr w:type="spellEnd"/>
+      <w:r>
+        <w:rPr>
+          <w:lang w:val="fr-BE"/>
+        </w:rPr>
+        <w:t xml:space="preserve">, N26, </w:t>
+      </w:r>
+      <w:proofErr w:type="spellStart"/>
+      <w:r>
+        <w:rPr>
+          <w:lang w:val="fr-BE"/>
+        </w:rPr>
+        <w:t>bunq</w:t>
+      </w:r>
+      <w:proofErr w:type="spellEnd"/>
+      <w:r>
+        <w:rPr>
+          <w:lang w:val="fr-BE"/>
+        </w:rPr>
+        <w:t xml:space="preserve"> — exactement la liste que j'avais proposée hier, bon signe.</w:t>
+      </w:r>
+    </w:p>
+    <w:p>
+      <w:pPr>
+        <w:numPr>
+          <w:ilvl w:val="0"/>
+          <w:numId w:val="20"/>
+        </w:numPr>
+        <w:rPr>
+          <w:lang w:val="fr-BE"/>
+        </w:rPr>
+      </w:pPr>
+      <w:proofErr w:type="gramStart"/>
+      <w:r>
+        <w:rPr>
+          <w:b/>
+          <w:bCs/>
+          <w:lang w:val="fr-BE"/>
+        </w:rPr>
+        <w:t>ce</w:t>
+      </w:r>
+      <w:proofErr w:type="gramEnd"/>
+      <w:r>
+        <w:rPr>
+          <w:b/>
+          <w:bCs/>
+          <w:lang w:val="fr-BE"/>
+        </w:rPr>
+        <w:t xml:space="preserve"> n'est pas un exercice de modélisation</w:t>
+      </w:r>
+      <w:r>
+        <w:rPr>
+          <w:lang w:val="fr-BE"/>
+        </w:rPr>
+        <w:t xml:space="preserve"> — l'accent explicite est </w:t>
+      </w:r>
+      <w:proofErr w:type="spellStart"/>
+      <w:r>
+        <w:rPr>
+          <w:lang w:val="fr-BE"/>
+        </w:rPr>
+        <w:t>sur</w:t>
+      </w:r>
+      <w:proofErr w:type="spellEnd"/>
+      <w:r>
+        <w:rPr>
+          <w:lang w:val="fr-BE"/>
+        </w:rPr>
+        <w:t xml:space="preserve"> : cadrer le problème, structurer de la donnée non structurée, faire de l'</w:t>
+      </w:r>
+      <w:r>
+        <w:rPr>
+          <w:b/>
+          <w:bCs/>
+          <w:lang w:val="fr-BE"/>
+        </w:rPr>
+        <w:t xml:space="preserve">extraction de </w:t>
+      </w:r>
+      <w:proofErr w:type="spellStart"/>
+      <w:r>
+        <w:rPr>
+          <w:b/>
+          <w:bCs/>
+          <w:lang w:val="fr-BE"/>
+        </w:rPr>
+        <w:t>features</w:t>
+      </w:r>
+      <w:proofErr w:type="spellEnd"/>
+      <w:r>
+        <w:rPr>
+          <w:lang w:val="fr-BE"/>
+        </w:rPr>
+        <w:t xml:space="preserve"> (transformer une page web en mini-</w:t>
+      </w:r>
+      <w:proofErr w:type="spellStart"/>
+      <w:r>
+        <w:rPr>
+          <w:lang w:val="fr-BE"/>
+        </w:rPr>
+        <w:t>dataset</w:t>
+      </w:r>
+      <w:proofErr w:type="spellEnd"/>
+      <w:r>
+        <w:rPr>
+          <w:lang w:val="fr-BE"/>
+        </w:rPr>
+        <w:t xml:space="preserve"> comparable), analyser, présenter. </w:t>
+      </w:r>
+      <w:proofErr w:type="gramStart"/>
+      <w:r>
+        <w:rPr>
+          <w:lang w:val="fr-BE"/>
+        </w:rPr>
+        <w:t>c'est</w:t>
+      </w:r>
+      <w:proofErr w:type="gramEnd"/>
+      <w:r>
+        <w:rPr>
+          <w:lang w:val="fr-BE"/>
+        </w:rPr>
+        <w:t xml:space="preserve"> un exercice de data </w:t>
+      </w:r>
+      <w:proofErr w:type="spellStart"/>
+      <w:r>
+        <w:rPr>
+          <w:lang w:val="fr-BE"/>
+        </w:rPr>
+        <w:t>scientist</w:t>
+      </w:r>
+      <w:proofErr w:type="spellEnd"/>
+      <w:r>
+        <w:rPr>
+          <w:lang w:val="fr-BE"/>
+        </w:rPr>
+        <w:t xml:space="preserve"> au sens propre, pas un projet ML.</w:t>
+      </w:r>
+    </w:p>
+    <w:p>
+      <w:pPr>
+        <w:numPr>
+          <w:ilvl w:val="0"/>
+          <w:numId w:val="20"/>
+        </w:numPr>
+        <w:rPr>
+          <w:lang w:val="fr-BE"/>
+        </w:rPr>
+      </w:pPr>
+      <w:proofErr w:type="gramStart"/>
+      <w:r>
+        <w:rPr>
+          <w:lang w:val="fr-BE"/>
+        </w:rPr>
+        <w:t>contrainte</w:t>
+      </w:r>
+      <w:proofErr w:type="gramEnd"/>
+      <w:r>
+        <w:rPr>
+          <w:lang w:val="fr-BE"/>
+        </w:rPr>
+        <w:t xml:space="preserve"> légale précise et citée dans le brief : ing.be/robots.txt et ing.be/sitemap-cms.xml comme exemples à vérifier avant toute collecte, pas de données personnelles, pas de contournement.</w:t>
+      </w:r>
+    </w:p>
+    <w:p>
+      <w:pPr>
+        <w:numPr>
+          <w:ilvl w:val="0"/>
+          <w:numId w:val="20"/>
+        </w:numPr>
+        <w:rPr>
+          <w:lang w:val="fr-BE"/>
+        </w:rPr>
+      </w:pPr>
+      <w:proofErr w:type="gramStart"/>
+      <w:r>
+        <w:rPr>
+          <w:lang w:val="fr-BE"/>
+        </w:rPr>
+        <w:t>deux</w:t>
+      </w:r>
+      <w:proofErr w:type="gramEnd"/>
+      <w:r>
+        <w:rPr>
+          <w:lang w:val="fr-BE"/>
+        </w:rPr>
+        <w:t xml:space="preserve"> publics de présentation distincts : </w:t>
+      </w:r>
+      <w:r>
+        <w:rPr>
+          <w:b/>
+          <w:bCs/>
+          <w:lang w:val="fr-BE"/>
+        </w:rPr>
+        <w:t>business</w:t>
+      </w:r>
+      <w:r>
+        <w:rPr>
+          <w:lang w:val="fr-BE"/>
+        </w:rPr>
+        <w:t xml:space="preserve"> ("qu'est-ce que ça signifie pour ING ?") et </w:t>
+      </w:r>
+      <w:r>
+        <w:rPr>
+          <w:b/>
+          <w:bCs/>
+          <w:lang w:val="fr-BE"/>
+        </w:rPr>
+        <w:t>data</w:t>
+      </w:r>
+      <w:r>
+        <w:rPr>
+          <w:lang w:val="fr-BE"/>
+        </w:rPr>
+        <w:t xml:space="preserve"> ("comment tu as fait, quelles limites ?") — donc deux livrables narratifs différents, pas juste un rapport unique.</w:t>
+      </w:r>
+    </w:p>
+    <w:p>
+      <w:pPr>
+        <w:numPr>
+          <w:ilvl w:val="0"/>
+          <w:numId w:val="20"/>
+        </w:numPr>
+        <w:rPr>
+          <w:lang w:val="fr-BE"/>
+        </w:rPr>
+      </w:pPr>
+      <w:r>
+        <w:rPr>
+          <w:lang w:val="fr-BE"/>
+        </w:rPr>
+        <w:t xml:space="preserve">MVP explicite : choisir un sous-ensemble restreint de banques + campagnes/pages, aller jusqu'au bout dessus, justifier ce qui est exclu. </w:t>
+      </w:r>
+      <w:proofErr w:type="gramStart"/>
+      <w:r>
+        <w:rPr>
+          <w:lang w:val="fr-BE"/>
+        </w:rPr>
+        <w:t>exactement</w:t>
+      </w:r>
+      <w:proofErr w:type="gramEnd"/>
+      <w:r>
+        <w:rPr>
+          <w:lang w:val="fr-BE"/>
+        </w:rPr>
+        <w:t xml:space="preserve"> l'esprit "scope réduit" qu'on avait déjà retenu pour une équipe de 3.</w:t>
+      </w:r>
+    </w:p>
+    <w:p>
+      <w:pPr>
+        <w:rPr>
+          <w:lang w:val="fr-BE"/>
+        </w:rPr>
+      </w:pPr>
+      <w:proofErr w:type="gramStart"/>
+      <w:r>
+        <w:rPr>
+          <w:b/>
+          <w:bCs/>
+          <w:lang w:val="fr-BE"/>
+        </w:rPr>
+        <w:t>le</w:t>
+      </w:r>
+      <w:proofErr w:type="gramEnd"/>
+      <w:r>
+        <w:rPr>
+          <w:b/>
+          <w:bCs/>
+          <w:lang w:val="fr-BE"/>
+        </w:rPr>
+        <w:t xml:space="preserve"> PDF côté business</w:t>
+      </w:r>
+      <w:r>
+        <w:rPr>
+          <w:lang w:val="fr-BE"/>
+        </w:rPr>
+        <w:t xml:space="preserve"> : l'équipe Customer AI d'ING (Diego, Victor) bosse sur l'orchestration des communications — problème concret : trop de bannières/pubs envoyées aux clients (irritant NPS, CTR faible). </w:t>
+      </w:r>
+      <w:proofErr w:type="gramStart"/>
+      <w:r>
+        <w:rPr>
+          <w:lang w:val="fr-BE"/>
+        </w:rPr>
+        <w:t>leurs</w:t>
+      </w:r>
+      <w:proofErr w:type="gramEnd"/>
+      <w:r>
+        <w:rPr>
+          <w:lang w:val="fr-BE"/>
+        </w:rPr>
+        <w:t xml:space="preserve"> propres slides montrent déjà une comparaison visuelle ING vs Belfius vs KBC vs BNP Fortis vs </w:t>
+      </w:r>
+      <w:proofErr w:type="spellStart"/>
+      <w:r>
+        <w:rPr>
+          <w:lang w:val="fr-BE"/>
+        </w:rPr>
+        <w:t>Revolut</w:t>
+      </w:r>
+      <w:proofErr w:type="spellEnd"/>
+      <w:r>
+        <w:rPr>
+          <w:lang w:val="fr-BE"/>
+        </w:rPr>
+        <w:t xml:space="preserve"> (palette de couleurs, ratio texte/image, statique vs animé) — ça donne un exemple très concret du type de comparaison attendu, et une piste naturelle de sous-ensemble MVP (ces 5 banques précisément, déjà utilisées par ING elle-même comme exemple).</w:t>
+      </w:r>
+    </w:p>
+    <w:p>
+      <w:pPr>
+        <w:rPr>
+          <w:lang w:val="fr-BE"/>
+        </w:rPr>
+      </w:pPr>
+      <w:proofErr w:type="gramStart"/>
+      <w:r>
+        <w:rPr>
+          <w:lang w:val="fr-BE"/>
+        </w:rPr>
+        <w:t>je</w:t>
+      </w:r>
+      <w:proofErr w:type="gramEnd"/>
+      <w:r>
+        <w:rPr>
+          <w:lang w:val="fr-BE"/>
+        </w:rPr>
+        <w:t xml:space="preserve"> révise le plan d'action complet là-dessus (scope campagnes précis, schéma de </w:t>
+      </w:r>
+      <w:proofErr w:type="spellStart"/>
+      <w:r>
+        <w:rPr>
+          <w:lang w:val="fr-BE"/>
+        </w:rPr>
+        <w:t>features</w:t>
+      </w:r>
+      <w:proofErr w:type="spellEnd"/>
+      <w:r>
+        <w:rPr>
+          <w:lang w:val="fr-BE"/>
+        </w:rPr>
+        <w:t xml:space="preserve"> par dimension, pipeline légal de collecte, double narration business/data) — je le fais maintenant ou tu veux d'abord me donner autre chose ?</w:t>
+      </w:r>
+    </w:p>
+    <w:p>
+      <w:pPr>
+        <w:rPr>
+          <w:lang w:val="fr-BE"/>
+        </w:rPr>
+      </w:pPr>
+      <w:r>
+        <w:rPr>
+          <w:lang w:val="fr-BE"/>
+        </w:rPr>
+        <w:br w:type="page"/>
+      </w:r>
+    </w:p>
+    <w:p>
+      <w:pPr>
+        <w:rPr>
+          <w:lang w:val="fr-BE"/>
+        </w:rPr>
+      </w:pPr>
+      <w:r>
+        <w:rPr>
+          <w:lang w:val="fr-BE"/>
+        </w:rPr>
+        <w:lastRenderedPageBreak/>
+        <w:t xml:space="preserve">Je fais le plan MVP révisé + le squelette de code, en parallèle. Ça prend quelques minutes — je construis, teste, et je </w:t>
+      </w:r>
+      <w:proofErr w:type="spellStart"/>
+      <w:r>
+        <w:rPr>
+          <w:lang w:val="fr-BE"/>
+        </w:rPr>
+        <w:t>livre.Maintenant</w:t>
+      </w:r>
+      <w:proofErr w:type="spellEnd"/>
+      <w:r>
+        <w:rPr>
+          <w:lang w:val="fr-BE"/>
+        </w:rPr>
+        <w:t xml:space="preserve"> le schéma de </w:t>
+      </w:r>
+      <w:proofErr w:type="spellStart"/>
+      <w:r>
+        <w:rPr>
+          <w:lang w:val="fr-BE"/>
+        </w:rPr>
+        <w:t>features</w:t>
+      </w:r>
+      <w:proofErr w:type="spellEnd"/>
+      <w:r>
+        <w:rPr>
+          <w:lang w:val="fr-BE"/>
+        </w:rPr>
+        <w:t xml:space="preserve"> (</w:t>
+      </w:r>
+      <w:proofErr w:type="spellStart"/>
+      <w:r>
+        <w:rPr>
+          <w:lang w:val="fr-BE"/>
+        </w:rPr>
+        <w:t>pydantic</w:t>
+      </w:r>
+      <w:proofErr w:type="spellEnd"/>
+      <w:r>
+        <w:rPr>
+          <w:lang w:val="fr-BE"/>
+        </w:rPr>
+        <w:t xml:space="preserve">, cohérent entre banques) et l'extraction déterministe :Maintenant l'extraction LLM (un seul appel structuré, pas d'agent) et le pipeline déterministe qui orchestre tout :Maintenant le </w:t>
+      </w:r>
+      <w:proofErr w:type="spellStart"/>
+      <w:r>
+        <w:rPr>
+          <w:lang w:val="fr-BE"/>
+        </w:rPr>
+        <w:t>dashboard</w:t>
+      </w:r>
+      <w:proofErr w:type="spellEnd"/>
+      <w:r>
+        <w:rPr>
+          <w:lang w:val="fr-BE"/>
+        </w:rPr>
+        <w:t xml:space="preserve"> </w:t>
+      </w:r>
+      <w:proofErr w:type="spellStart"/>
+      <w:r>
+        <w:rPr>
+          <w:lang w:val="fr-BE"/>
+        </w:rPr>
+        <w:t>Streamlit</w:t>
+      </w:r>
+      <w:proofErr w:type="spellEnd"/>
+      <w:r>
+        <w:rPr>
+          <w:lang w:val="fr-BE"/>
+        </w:rPr>
+        <w:t>, les tests, et les fichiers de config/déploiement :Maintenant les tests :Maintenant les fichiers de config/déploiement (</w:t>
+      </w:r>
+      <w:proofErr w:type="spellStart"/>
+      <w:r>
+        <w:rPr>
+          <w:lang w:val="fr-BE"/>
+        </w:rPr>
+        <w:t>requirements</w:t>
+      </w:r>
+      <w:proofErr w:type="spellEnd"/>
+      <w:r>
+        <w:rPr>
+          <w:lang w:val="fr-BE"/>
+        </w:rPr>
+        <w:t>, .</w:t>
+      </w:r>
+      <w:proofErr w:type="spellStart"/>
+      <w:r>
+        <w:rPr>
+          <w:lang w:val="fr-BE"/>
+        </w:rPr>
+        <w:t>env.example</w:t>
+      </w:r>
+      <w:proofErr w:type="spellEnd"/>
+      <w:r>
+        <w:rPr>
+          <w:lang w:val="fr-BE"/>
+        </w:rPr>
+        <w:t xml:space="preserve">, </w:t>
+      </w:r>
+      <w:proofErr w:type="spellStart"/>
+      <w:r>
+        <w:rPr>
+          <w:lang w:val="fr-BE"/>
+        </w:rPr>
+        <w:t>Dockerfile</w:t>
+      </w:r>
+      <w:proofErr w:type="spellEnd"/>
+      <w:r>
+        <w:rPr>
+          <w:lang w:val="fr-BE"/>
+        </w:rPr>
+        <w:t xml:space="preserve">, </w:t>
+      </w:r>
+      <w:proofErr w:type="spellStart"/>
+      <w:r>
+        <w:rPr>
+          <w:lang w:val="fr-BE"/>
+        </w:rPr>
+        <w:t>render.yaml</w:t>
+      </w:r>
+      <w:proofErr w:type="spellEnd"/>
+      <w:r>
+        <w:rPr>
+          <w:lang w:val="fr-BE"/>
+        </w:rPr>
+        <w:t>, README) :Maintenant, tests réels (pas juste écrits — je les fais tourner) :Maintenant le plan révisé, aligné sur le brief officiel et le code :voilà les deux (14/09) : le plan MVP révisé, et le squelette de code complet et testé.</w:t>
+      </w:r>
+    </w:p>
+    <w:p>
+      <w:pPr>
+        <w:rPr>
+          <w:lang w:val="fr-BE"/>
+        </w:rPr>
+      </w:pPr>
+      <w:r>
+        <w:rPr>
+          <w:b/>
+          <w:bCs/>
+          <w:lang w:val="fr-BE"/>
+        </w:rPr>
+        <w:t>ce que le code fait concrètement</w:t>
+      </w:r>
+      <w:r>
+        <w:rPr>
+          <w:lang w:val="fr-BE"/>
+        </w:rPr>
+        <w:t xml:space="preserve"> : src/compliance.py vérifie robots.txt avant chaque </w:t>
+      </w:r>
+      <w:proofErr w:type="spellStart"/>
+      <w:r>
+        <w:rPr>
+          <w:lang w:val="fr-BE"/>
+        </w:rPr>
+        <w:t>fetch</w:t>
+      </w:r>
+      <w:proofErr w:type="spellEnd"/>
+      <w:r>
+        <w:rPr>
+          <w:lang w:val="fr-BE"/>
+        </w:rPr>
+        <w:t xml:space="preserve"> (fail-</w:t>
+      </w:r>
+      <w:proofErr w:type="spellStart"/>
+      <w:r>
+        <w:rPr>
+          <w:lang w:val="fr-BE"/>
+        </w:rPr>
+        <w:t>closed</w:t>
+      </w:r>
+      <w:proofErr w:type="spellEnd"/>
+      <w:r>
+        <w:rPr>
+          <w:lang w:val="fr-BE"/>
+        </w:rPr>
+        <w:t xml:space="preserve"> — si ça ne peut pas être lu, on refuse par défaut plutôt que de scraper quand même) ; src/scraper.py extrait les </w:t>
+      </w:r>
+      <w:proofErr w:type="spellStart"/>
+      <w:r>
+        <w:rPr>
+          <w:lang w:val="fr-BE"/>
+        </w:rPr>
+        <w:t>features</w:t>
+      </w:r>
+      <w:proofErr w:type="spellEnd"/>
+      <w:r>
+        <w:rPr>
+          <w:lang w:val="fr-BE"/>
+        </w:rPr>
+        <w:t xml:space="preserve"> déterministes (mots, images, CTA, animation) ; src/visual_features.py extrait les couleurs dominantes de l'image </w:t>
+      </w:r>
+      <w:proofErr w:type="spellStart"/>
+      <w:r>
+        <w:rPr>
+          <w:lang w:val="fr-BE"/>
+        </w:rPr>
+        <w:t>hero</w:t>
+      </w:r>
+      <w:proofErr w:type="spellEnd"/>
+      <w:r>
+        <w:rPr>
+          <w:lang w:val="fr-BE"/>
+        </w:rPr>
+        <w:t xml:space="preserve"> ; src/llm_extractor.py fait </w:t>
+      </w:r>
+      <w:r>
+        <w:rPr>
+          <w:b/>
+          <w:bCs/>
+          <w:lang w:val="fr-BE"/>
+        </w:rPr>
+        <w:t>un seul appel LLM structuré</w:t>
+      </w:r>
+      <w:r>
+        <w:rPr>
+          <w:lang w:val="fr-BE"/>
+        </w:rPr>
+        <w:t xml:space="preserve"> par page (pas d'agent — la justification est documentée dans le code même) pour </w:t>
+      </w:r>
+      <w:proofErr w:type="spellStart"/>
+      <w:r>
+        <w:rPr>
+          <w:lang w:val="fr-BE"/>
+        </w:rPr>
+        <w:t>tone</w:t>
+      </w:r>
+      <w:proofErr w:type="spellEnd"/>
+      <w:r>
+        <w:rPr>
+          <w:lang w:val="fr-BE"/>
+        </w:rPr>
+        <w:t>/</w:t>
+      </w:r>
+      <w:proofErr w:type="spellStart"/>
+      <w:r>
+        <w:rPr>
+          <w:lang w:val="fr-BE"/>
+        </w:rPr>
+        <w:t>layout</w:t>
+      </w:r>
+      <w:proofErr w:type="spellEnd"/>
+      <w:r>
+        <w:rPr>
+          <w:lang w:val="fr-BE"/>
+        </w:rPr>
+        <w:t xml:space="preserve">/topics/value proposition, validé par </w:t>
+      </w:r>
+      <w:proofErr w:type="spellStart"/>
+      <w:r>
+        <w:rPr>
+          <w:lang w:val="fr-BE"/>
+        </w:rPr>
+        <w:t>pydantic</w:t>
+      </w:r>
+      <w:proofErr w:type="spellEnd"/>
+      <w:r>
+        <w:rPr>
+          <w:lang w:val="fr-BE"/>
+        </w:rPr>
+        <w:t xml:space="preserve"> ; src/storage.py sauve tout en SQLite ; app/streamlit_app.py affiche le </w:t>
+      </w:r>
+      <w:proofErr w:type="spellStart"/>
+      <w:r>
+        <w:rPr>
+          <w:lang w:val="fr-BE"/>
+        </w:rPr>
+        <w:t>dashboard</w:t>
+      </w:r>
+      <w:proofErr w:type="spellEnd"/>
+      <w:r>
+        <w:rPr>
+          <w:lang w:val="fr-BE"/>
+        </w:rPr>
+        <w:t xml:space="preserve"> de comparaison. 12 tests passent (</w:t>
+      </w:r>
+      <w:proofErr w:type="spellStart"/>
+      <w:r>
+        <w:rPr>
+          <w:lang w:val="fr-BE"/>
+        </w:rPr>
+        <w:t>pytest</w:t>
+      </w:r>
+      <w:proofErr w:type="spellEnd"/>
+      <w:r>
+        <w:rPr>
+          <w:lang w:val="fr-BE"/>
+        </w:rPr>
+        <w:t xml:space="preserve">), </w:t>
+      </w:r>
+      <w:proofErr w:type="spellStart"/>
+      <w:r>
+        <w:rPr>
+          <w:lang w:val="fr-BE"/>
+        </w:rPr>
+        <w:t>Dockerfile</w:t>
+      </w:r>
+      <w:proofErr w:type="spellEnd"/>
+      <w:r>
+        <w:rPr>
+          <w:lang w:val="fr-BE"/>
+        </w:rPr>
+        <w:t>/docker-compose/</w:t>
+      </w:r>
+      <w:proofErr w:type="spellStart"/>
+      <w:r>
+        <w:rPr>
+          <w:lang w:val="fr-BE"/>
+        </w:rPr>
+        <w:t>render.yaml</w:t>
+      </w:r>
+      <w:proofErr w:type="spellEnd"/>
+      <w:r>
+        <w:rPr>
+          <w:lang w:val="fr-BE"/>
+        </w:rPr>
+        <w:t xml:space="preserve"> prêts.</w:t>
+      </w:r>
+    </w:p>
+    <w:p>
+      <w:pPr>
+        <w:rPr>
+          <w:lang w:val="fr-BE"/>
+        </w:rPr>
+      </w:pPr>
+      <w:proofErr w:type="gramStart"/>
+      <w:r>
+        <w:rPr>
+          <w:lang w:val="fr-BE"/>
+        </w:rPr>
+        <w:t>scope</w:t>
+      </w:r>
+      <w:proofErr w:type="gramEnd"/>
+      <w:r>
+        <w:rPr>
+          <w:lang w:val="fr-BE"/>
+        </w:rPr>
+        <w:t xml:space="preserve"> MVP retenu dans src/config.py : ING + KBC + BNP Paribas Fortis + </w:t>
+      </w:r>
+      <w:proofErr w:type="spellStart"/>
+      <w:r>
+        <w:rPr>
+          <w:lang w:val="fr-BE"/>
+        </w:rPr>
+        <w:t>Revolut</w:t>
+      </w:r>
+      <w:proofErr w:type="spellEnd"/>
+      <w:r>
+        <w:rPr>
+          <w:lang w:val="fr-BE"/>
+        </w:rPr>
+        <w:t>, une page épargne par banque — facile d'ajouter Argenta/</w:t>
+      </w:r>
+      <w:proofErr w:type="spellStart"/>
+      <w:r>
+        <w:rPr>
+          <w:lang w:val="fr-BE"/>
+        </w:rPr>
+        <w:t>Crelan</w:t>
+      </w:r>
+      <w:proofErr w:type="spellEnd"/>
+      <w:r>
+        <w:rPr>
+          <w:lang w:val="fr-BE"/>
+        </w:rPr>
+        <w:t>/N26/</w:t>
+      </w:r>
+      <w:proofErr w:type="spellStart"/>
+      <w:r>
+        <w:rPr>
+          <w:lang w:val="fr-BE"/>
+        </w:rPr>
+        <w:t>bunq</w:t>
+      </w:r>
+      <w:proofErr w:type="spellEnd"/>
+      <w:r>
+        <w:rPr>
+          <w:lang w:val="fr-BE"/>
+        </w:rPr>
+        <w:t xml:space="preserve"> si vous voulez élargir, juste décommenter/ajouter une ligne.</w:t>
+      </w:r>
+    </w:p>
+    <w:p>
+      <w:pPr>
+        <w:rPr>
+          <w:lang w:val="fr-BE"/>
+        </w:rPr>
+      </w:pPr>
+      <w:proofErr w:type="gramStart"/>
+      <w:r>
+        <w:rPr>
+          <w:b/>
+          <w:bCs/>
+          <w:lang w:val="fr-BE"/>
+        </w:rPr>
+        <w:t>point</w:t>
+      </w:r>
+      <w:proofErr w:type="gramEnd"/>
+      <w:r>
+        <w:rPr>
+          <w:b/>
+          <w:bCs/>
+          <w:lang w:val="fr-BE"/>
+        </w:rPr>
+        <w:t xml:space="preserve"> important</w:t>
+      </w:r>
+      <w:r>
+        <w:rPr>
+          <w:lang w:val="fr-BE"/>
+        </w:rPr>
+        <w:t xml:space="preserve"> : le </w:t>
+      </w:r>
+      <w:proofErr w:type="spellStart"/>
+      <w:r>
+        <w:rPr>
+          <w:lang w:val="fr-BE"/>
+        </w:rPr>
+        <w:t>sandbox</w:t>
+      </w:r>
+      <w:proofErr w:type="spellEnd"/>
+      <w:r>
+        <w:rPr>
+          <w:lang w:val="fr-BE"/>
+        </w:rPr>
+        <w:t xml:space="preserve"> où j'ai codé n'a pas accès à internet public (liste blanche restreinte), donc je n'ai pas pu lancer python -m </w:t>
+      </w:r>
+      <w:proofErr w:type="spellStart"/>
+      <w:r>
+        <w:rPr>
+          <w:lang w:val="fr-BE"/>
+        </w:rPr>
+        <w:t>src.pipeline</w:t>
+      </w:r>
+      <w:proofErr w:type="spellEnd"/>
+      <w:r>
+        <w:rPr>
+          <w:lang w:val="fr-BE"/>
+        </w:rPr>
+        <w:t xml:space="preserve"> sur les vraies pages ING/KBC/etc. les tests unitaires (</w:t>
+      </w:r>
+      <w:proofErr w:type="spellStart"/>
+      <w:r>
+        <w:rPr>
+          <w:lang w:val="fr-BE"/>
+        </w:rPr>
+        <w:t>mockés</w:t>
+      </w:r>
+      <w:proofErr w:type="spellEnd"/>
+      <w:r>
+        <w:rPr>
+          <w:lang w:val="fr-BE"/>
+        </w:rPr>
+        <w:t>) confirment que la logique est correcte, mais il faudra faire tourner le pipeline sur votre machine pour la première fois réelle — normalement ça marche tel quel, mais gardez du temps lundi pour ajuster si une page a une structure HTML inattendue.</w:t>
+      </w:r>
+    </w:p>
+    <w:p>
+      <w:pPr>
+        <w:rPr>
+          <w:lang w:val="fr-BE"/>
+        </w:rPr>
+      </w:pPr>
+    </w:p>
+    <w:p>
+      <w:pPr>
+        <w:rPr>
+          <w:lang w:val="fr-BE"/>
         </w:rPr>
       </w:pPr>
     </w:p>
@@ -2157,7 +2337,7 @@
 </file>
 
 <file path=word/numbering.xml><?xml version="1.0" encoding="utf-8"?>
-<w:numbering xmlns:wpc="http://schemas.microsoft.com/office/word/2010/wordprocessingCanvas" xmlns:cx="http://schemas.microsoft.com/office/drawing/2014/chartex" xmlns:cx1="http://schemas.microsoft.com/office/drawing/2015/9/8/chartex" xmlns:cx2="http://schemas.microsoft.com/office/drawing/2015/10/21/chartex" xmlns:cx3="http://schemas.microsoft.com/office/drawing/2016/5/9/chartex" xmlns:cx4="http://schemas.microsoft.com/office/drawing/2016/5/10/chartex" xmlns:cx5="http://schemas.microsoft.com/office/drawing/2016/5/11/chartex" xmlns:cx6="http://schemas.microsoft.com/office/drawing/2016/5/12/chartex" xmlns:cx7="http://schemas.microsoft.com/office/drawing/2016/5/13/chartex" xmlns:cx8="http://schemas.microsoft.com/office/drawing/2016/5/14/chartex" xmlns:mc="http://schemas.openxmlformats.org/markup-compatibility/2006" xmlns:aink="http://schemas.microsoft.com/office/drawing/2016/ink" xmlns:am3d="http://schemas.microsoft.com/office/drawing/2017/model3d" xmlns:o="urn:schemas-microsoft-com:office:office" xmlns:oel="http://schemas.microsoft.com/office/2019/extlst" xmlns:r="http://schemas.openxmlformats.org/officeDocument/2006/relationships" xmlns:m="http://schemas.openxmlformats.org/officeDocument/2006/math" xmlns:v="urn:schemas-microsoft-com:vml" xmlns:wp14="http://schemas.microsoft.com/office/word/2010/wordprocessingDrawing" xmlns:wp="http://schemas.openxmlformats.org/drawingml/2006/wordprocessingDrawing" xmlns:w10="urn:schemas-microsoft-com:office:word" xmlns:w="http://schemas.openxmlformats.org/wordprocessingml/2006/main" xmlns:w14="http://schemas.microsoft.com/office/word/2010/wordml" xmlns:w15="http://schemas.microsoft.com/office/word/2012/wordml" xmlns:w16cex="http://schemas.microsoft.com/office/word/2018/wordml/cex" xmlns:w16cid="http://schemas.microsoft.com/office/word/2016/wordml/cid" xmlns:w16="http://schemas.microsoft.com/office/word/2018/wordml" xmlns:w16du="http://schemas.microsoft.com/office/word/2023/wordml/word16du" xmlns:w16sdtdh="http://schemas.microsoft.com/office/word/2020/wordml/sdtdatahash" xmlns:w16sdtfl="http://schemas.microsoft.com/office/word/2024/wordml/sdtformatlock" xmlns:w16se="http://schemas.microsoft.com/office/word/2015/wordml/symex" xmlns:wpg="http://schemas.microsoft.com/office/word/2010/wordprocessingGroup" xmlns:wpi="http://schemas.microsoft.com/office/word/2010/wordprocessingInk" xmlns:wne="http://schemas.microsoft.com/office/word/2006/wordml" xmlns:wps="http://schemas.microsoft.com/office/word/2010/wordprocessingShape" mc:Ignorable="w14 w15 w16se w16cid w16 w16cex w16sdtdh w16sdtfl w16du wp14">
+<w:numbering xmlns:wpc="http://schemas.microsoft.com/office/word/2010/wordprocessingCanvas" xmlns:cx="http://schemas.microsoft.com/office/drawing/2014/chartex" xmlns:cx1="http://schemas.microsoft.com/office/drawing/2015/9/8/chartex" xmlns:cx2="http://schemas.microsoft.com/office/drawing/2015/10/21/chartex" xmlns:cx3="http://schemas.microsoft.com/office/drawing/2016/5/9/chartex" xmlns:cx4="http://schemas.microsoft.com/office/drawing/2016/5/10/chartex" xmlns:cx5="http://schemas.microsoft.com/office/drawing/2016/5/11/chartex" xmlns:cx6="http://schemas.microsoft.com/office/drawing/2016/5/12/chartex" xmlns:cx7="http://schemas.microsoft.com/office/drawing/2016/5/13/chartex" xmlns:cx8="http://schemas.microsoft.com/office/drawing/2016/5/14/chartex" xmlns:mc="http://schemas.openxmlformats.org/markup-compatibility/2006" xmlns:aink="http://schemas.microsoft.com/office/drawing/2016/ink" xmlns:am3d="http://schemas.microsoft.com/office/drawing/2017/model3d" xmlns:o="urn:schemas-microsoft-com:office:office" xmlns:oel="http://schemas.microsoft.com/office/2019/extlst" xmlns:r="http://schemas.openxmlformats.org/officeDocument/2006/relationships" xmlns:m="http://schemas.openxmlformats.org/officeDocument/2006/math" xmlns:v="urn:schemas-microsoft-com:vml" xmlns:wp14="http://schemas.microsoft.com/office/word/2010/wordprocessingDrawing" xmlns:wp="http://schemas.openxmlformats.org/drawingml/2006/wordprocessingDrawing" xmlns:w10="urn:schemas-microsoft-com:office:word" xmlns:w="http://schemas.openxmlformats.org/wordprocessingml/2006/main" xmlns:w14="http://schemas.microsoft.com/office/word/2010/wordml" xmlns:w15="http://schemas.microsoft.com/office/word/2012/wordml" xmlns:w16cex="http://schemas.microsoft.com/office/word/2018/wordml/cex" xmlns:w16cid="http://schemas.microsoft.com/office/word/2016/wordml/cid" xmlns:w16="http://schemas.microsoft.com/office/word/2018/wordml" xmlns:w16sdtdh="http://schemas.microsoft.com/office/word/2020/wordml/sdtdatahash" xmlns:w16se="http://schemas.microsoft.com/office/word/2015/wordml/symex" xmlns:wpg="http://schemas.microsoft.com/office/word/2010/wordprocessingGroup" xmlns:wpi="http://schemas.microsoft.com/office/word/2010/wordprocessingInk" xmlns:wne="http://schemas.microsoft.com/office/word/2006/wordml" xmlns:wps="http://schemas.microsoft.com/office/word/2010/wordprocessingShape" mc:Ignorable="w14 w15 w16se w16cid w16 w16cex w16sdtdh wp14">
   <w:abstractNum w:abstractNumId="0" w15:restartNumberingAfterBreak="0">
     <w:nsid w:val="07707661"/>
     <w:multiLevelType w:val="multilevel"/>
@@ -4394,6 +4574,155 @@
     </w:lvl>
   </w:abstractNum>
   <w:abstractNum w:abstractNumId="15" w15:restartNumberingAfterBreak="0">
+    <w:nsid w:val="52F66732"/>
+    <w:multiLevelType w:val="multilevel"/>
+    <w:tmpl w:val="59745088"/>
+    <w:lvl w:ilvl="0">
+      <w:start w:val="1"/>
+      <w:numFmt w:val="bullet"/>
+      <w:lvlText w:val=""/>
+      <w:lvlJc w:val="left"/>
+      <w:pPr>
+        <w:tabs>
+          <w:tab w:val="num" w:pos="720"/>
+        </w:tabs>
+        <w:ind w:left="720" w:hanging="360"/>
+      </w:pPr>
+      <w:rPr>
+        <w:rFonts w:ascii="Symbol" w:hAnsi="Symbol" w:hint="default"/>
+        <w:sz w:val="20"/>
+      </w:rPr>
+    </w:lvl>
+    <w:lvl w:ilvl="1" w:tentative="1">
+      <w:start w:val="1"/>
+      <w:numFmt w:val="bullet"/>
+      <w:lvlText w:val="o"/>
+      <w:lvlJc w:val="left"/>
+      <w:pPr>
+        <w:tabs>
+          <w:tab w:val="num" w:pos="1440"/>
+        </w:tabs>
+        <w:ind w:left="1440" w:hanging="360"/>
+      </w:pPr>
+      <w:rPr>
+        <w:rFonts w:ascii="Courier New" w:hAnsi="Courier New" w:hint="default"/>
+        <w:sz w:val="20"/>
+      </w:rPr>
+    </w:lvl>
+    <w:lvl w:ilvl="2" w:tentative="1">
+      <w:start w:val="1"/>
+      <w:numFmt w:val="bullet"/>
+      <w:lvlText w:val=""/>
+      <w:lvlJc w:val="left"/>
+      <w:pPr>
+        <w:tabs>
+          <w:tab w:val="num" w:pos="2160"/>
+        </w:tabs>
+        <w:ind w:left="2160" w:hanging="360"/>
+      </w:pPr>
+      <w:rPr>
+        <w:rFonts w:ascii="Wingdings" w:hAnsi="Wingdings" w:hint="default"/>
+        <w:sz w:val="20"/>
+      </w:rPr>
+    </w:lvl>
+    <w:lvl w:ilvl="3" w:tentative="1">
+      <w:start w:val="1"/>
+      <w:numFmt w:val="bullet"/>
+      <w:lvlText w:val=""/>
+      <w:lvlJc w:val="left"/>
+      <w:pPr>
+        <w:tabs>
+          <w:tab w:val="num" w:pos="2880"/>
+        </w:tabs>
+        <w:ind w:left="2880" w:hanging="360"/>
+      </w:pPr>
+      <w:rPr>
+        <w:rFonts w:ascii="Wingdings" w:hAnsi="Wingdings" w:hint="default"/>
+        <w:sz w:val="20"/>
+      </w:rPr>
+    </w:lvl>
+    <w:lvl w:ilvl="4" w:tentative="1">
+      <w:start w:val="1"/>
+      <w:numFmt w:val="bullet"/>
+      <w:lvlText w:val=""/>
+      <w:lvlJc w:val="left"/>
+      <w:pPr>
+        <w:tabs>
+          <w:tab w:val="num" w:pos="3600"/>
+        </w:tabs>
+        <w:ind w:left="3600" w:hanging="360"/>
+      </w:pPr>
+      <w:rPr>
+        <w:rFonts w:ascii="Wingdings" w:hAnsi="Wingdings" w:hint="default"/>
+        <w:sz w:val="20"/>
+      </w:rPr>
+    </w:lvl>
+    <w:lvl w:ilvl="5" w:tentative="1">
+      <w:start w:val="1"/>
+      <w:numFmt w:val="bullet"/>
+      <w:lvlText w:val=""/>
+      <w:lvlJc w:val="left"/>
+      <w:pPr>
+        <w:tabs>
+          <w:tab w:val="num" w:pos="4320"/>
+        </w:tabs>
+        <w:ind w:left="4320" w:hanging="360"/>
+      </w:pPr>
+      <w:rPr>
+        <w:rFonts w:ascii="Wingdings" w:hAnsi="Wingdings" w:hint="default"/>
+        <w:sz w:val="20"/>
+      </w:rPr>
+    </w:lvl>
+    <w:lvl w:ilvl="6" w:tentative="1">
+      <w:start w:val="1"/>
+      <w:numFmt w:val="bullet"/>
+      <w:lvlText w:val=""/>
+      <w:lvlJc w:val="left"/>
+      <w:pPr>
+        <w:tabs>
+          <w:tab w:val="num" w:pos="5040"/>
+        </w:tabs>
+        <w:ind w:left="5040" w:hanging="360"/>
+      </w:pPr>
+      <w:rPr>
+        <w:rFonts w:ascii="Wingdings" w:hAnsi="Wingdings" w:hint="default"/>
+        <w:sz w:val="20"/>
+      </w:rPr>
+    </w:lvl>
+    <w:lvl w:ilvl="7" w:tentative="1">
+      <w:start w:val="1"/>
+      <w:numFmt w:val="bullet"/>
+      <w:lvlText w:val=""/>
+      <w:lvlJc w:val="left"/>
+      <w:pPr>
+        <w:tabs>
+          <w:tab w:val="num" w:pos="5760"/>
+        </w:tabs>
+        <w:ind w:left="5760" w:hanging="360"/>
+      </w:pPr>
+      <w:rPr>
+        <w:rFonts w:ascii="Wingdings" w:hAnsi="Wingdings" w:hint="default"/>
+        <w:sz w:val="20"/>
+      </w:rPr>
+    </w:lvl>
+    <w:lvl w:ilvl="8" w:tentative="1">
+      <w:start w:val="1"/>
+      <w:numFmt w:val="bullet"/>
+      <w:lvlText w:val=""/>
+      <w:lvlJc w:val="left"/>
+      <w:pPr>
+        <w:tabs>
+          <w:tab w:val="num" w:pos="6480"/>
+        </w:tabs>
+        <w:ind w:left="6480" w:hanging="360"/>
+      </w:pPr>
+      <w:rPr>
+        <w:rFonts w:ascii="Wingdings" w:hAnsi="Wingdings" w:hint="default"/>
+        <w:sz w:val="20"/>
+      </w:rPr>
+    </w:lvl>
+  </w:abstractNum>
+  <w:abstractNum w:abstractNumId="16" w15:restartNumberingAfterBreak="0">
     <w:nsid w:val="657505CF"/>
     <w:multiLevelType w:val="multilevel"/>
     <w:tmpl w:val="2C3EA34A"/>
@@ -4542,7 +4871,7 @@
       </w:rPr>
     </w:lvl>
   </w:abstractNum>
-  <w:abstractNum w:abstractNumId="16" w15:restartNumberingAfterBreak="0">
+  <w:abstractNum w:abstractNumId="17" w15:restartNumberingAfterBreak="0">
     <w:nsid w:val="6AA45310"/>
     <w:multiLevelType w:val="multilevel"/>
     <w:tmpl w:val="A6B01E2E"/>
@@ -4691,7 +5020,7 @@
       </w:rPr>
     </w:lvl>
   </w:abstractNum>
-  <w:abstractNum w:abstractNumId="17" w15:restartNumberingAfterBreak="0">
+  <w:abstractNum w:abstractNumId="18" w15:restartNumberingAfterBreak="0">
     <w:nsid w:val="6CAC4D47"/>
     <w:multiLevelType w:val="multilevel"/>
     <w:tmpl w:val="E5DA6F7E"/>
@@ -4840,7 +5169,7 @@
       </w:rPr>
     </w:lvl>
   </w:abstractNum>
-  <w:abstractNum w:abstractNumId="18" w15:restartNumberingAfterBreak="0">
+  <w:abstractNum w:abstractNumId="19" w15:restartNumberingAfterBreak="0">
     <w:nsid w:val="6FCB14AA"/>
     <w:multiLevelType w:val="multilevel"/>
     <w:tmpl w:val="092EA462"/>
@@ -4996,13 +5325,13 @@
     <w:abstractNumId w:val="10"/>
   </w:num>
   <w:num w:numId="3" w16cid:durableId="1636913338">
-    <w:abstractNumId w:val="15"/>
+    <w:abstractNumId w:val="16"/>
   </w:num>
   <w:num w:numId="4" w16cid:durableId="845246874">
     <w:abstractNumId w:val="9"/>
   </w:num>
   <w:num w:numId="5" w16cid:durableId="2060014741">
-    <w:abstractNumId w:val="18"/>
+    <w:abstractNumId w:val="19"/>
   </w:num>
   <w:num w:numId="6" w16cid:durableId="1773934993">
     <w:abstractNumId w:val="2"/>
@@ -5011,7 +5340,7 @@
     <w:abstractNumId w:val="0"/>
   </w:num>
   <w:num w:numId="8" w16cid:durableId="1757047355">
-    <w:abstractNumId w:val="17"/>
+    <w:abstractNumId w:val="18"/>
   </w:num>
   <w:num w:numId="9" w16cid:durableId="78451420">
     <w:abstractNumId w:val="7"/>
@@ -5020,7 +5349,7 @@
     <w:abstractNumId w:val="5"/>
   </w:num>
   <w:num w:numId="11" w16cid:durableId="409667841">
-    <w:abstractNumId w:val="16"/>
+    <w:abstractNumId w:val="17"/>
   </w:num>
   <w:num w:numId="12" w16cid:durableId="917330773">
     <w:abstractNumId w:val="6"/>
@@ -5046,11 +5375,14 @@
   <w:num w:numId="19" w16cid:durableId="1840080002">
     <w:abstractNumId w:val="1"/>
   </w:num>
+  <w:num w:numId="20" w16cid:durableId="1699088582">
+    <w:abstractNumId w:val="15"/>
+  </w:num>
 </w:numbering>
 </file>
 
 <file path=word/styles.xml><?xml version="1.0" encoding="utf-8"?>
-<w:styles xmlns:mc="http://schemas.openxmlformats.org/markup-compatibility/2006" xmlns:r="http://schemas.openxmlformats.org/officeDocument/2006/relationships" xmlns:w="http://schemas.openxmlformats.org/wordprocessingml/2006/main" xmlns:w14="http://schemas.microsoft.com/office/word/2010/wordml" xmlns:w15="http://schemas.microsoft.com/office/word/2012/wordml" xmlns:w16cex="http://schemas.microsoft.com/office/word/2018/wordml/cex" xmlns:w16cid="http://schemas.microsoft.com/office/word/2016/wordml/cid" xmlns:w16="http://schemas.microsoft.com/office/word/2018/wordml" xmlns:w16du="http://schemas.microsoft.com/office/word/2023/wordml/word16du" xmlns:w16sdtdh="http://schemas.microsoft.com/office/word/2020/wordml/sdtdatahash" xmlns:w16sdtfl="http://schemas.microsoft.com/office/word/2024/wordml/sdtformatlock" xmlns:w16se="http://schemas.microsoft.com/office/word/2015/wordml/symex" mc:Ignorable="w14 w15 w16se w16cid w16 w16cex w16sdtdh w16sdtfl w16du">
+<w:styles xmlns:mc="http://schemas.openxmlformats.org/markup-compatibility/2006" xmlns:r="http://schemas.openxmlformats.org/officeDocument/2006/relationships" xmlns:w="http://schemas.openxmlformats.org/wordprocessingml/2006/main" xmlns:w14="http://schemas.microsoft.com/office/word/2010/wordml" xmlns:w15="http://schemas.microsoft.com/office/word/2012/wordml" xmlns:w16cex="http://schemas.microsoft.com/office/word/2018/wordml/cex" xmlns:w16cid="http://schemas.microsoft.com/office/word/2016/wordml/cid" xmlns:w16="http://schemas.microsoft.com/office/word/2018/wordml" xmlns:w16sdtdh="http://schemas.microsoft.com/office/word/2020/wordml/sdtdatahash" xmlns:w16se="http://schemas.microsoft.com/office/word/2015/wordml/symex" mc:Ignorable="w14 w15 w16se w16cid w16 w16cex w16sdtdh">
   <w:docDefaults>
     <w:rPrDefault>
       <w:rPr>
@@ -5058,7 +5390,7 @@
         <w:kern w:val="2"/>
         <w:sz w:val="24"/>
         <w:szCs w:val="24"/>
-        <w:lang w:val="en-BE" w:eastAsia="en-US" w:bidi="ar-SA"/>
+        <w:lang w:eastAsia="en-US" w:bidi="ar-SA"/>
         <w14:ligatures w14:val="standardContextual"/>
       </w:rPr>
     </w:rPrDefault>
@@ -5984,6 +6316,18 @@
       <w:shd w:val="clear" w:color="auto" w:fill="E1DFDD"/>
     </w:rPr>
   </w:style>
+  <w:style w:type="character" w:styleId="FollowedHyperlink">
+    <w:name w:val="FollowedHyperlink"/>
+    <w:basedOn w:val="DefaultParagraphFont"/>
+    <w:uiPriority w:val="99"/>
+    <w:semiHidden/>
+    <w:unhideWhenUsed/>
+    <w:rsid w:val="007F0F0E"/>
+    <w:rPr>
+      <w:color w:val="96607D" w:themeColor="followedHyperlink"/>
+      <w:u w:val="single"/>
+    </w:rPr>
+  </w:style>
 </w:styles>
 </file>
 
@@ -6303,6 +6647,26 @@
 </file>
 
 <file path=customXml/item1.xml><?xml version="1.0" encoding="utf-8"?>
+<p:properties xmlns:p="http://schemas.microsoft.com/office/2006/metadata/properties" xmlns:xsi="http://www.w3.org/2001/XMLSchema-instance" xmlns:pc="http://schemas.microsoft.com/office/infopath/2007/PartnerControls">
+  <documentManagement>
+    <TaxCatchAll xmlns="e576a107-c33d-4a2c-aa97-67272a71cb44"/>
+    <lcf76f155ced4ddcb4097134ff3c332f xmlns="c1aff267-730c-4217-94a2-113862932d84">
+      <Terms xmlns="http://schemas.microsoft.com/office/infopath/2007/PartnerControls"/>
+    </lcf76f155ced4ddcb4097134ff3c332f>
+  </documentManagement>
+</p:properties>
+</file>
+
+<file path=customXml/item2.xml><?xml version="1.0" encoding="utf-8"?>
+<?mso-contentType ?>
+<FormTemplates xmlns="http://schemas.microsoft.com/sharepoint/v3/contenttype/forms">
+  <Display>DocumentLibraryForm</Display>
+  <Edit>DocumentLibraryForm</Edit>
+  <New>DocumentLibraryForm</New>
+</FormTemplates>
+</file>
+
+<file path=customXml/item3.xml><?xml version="1.0" encoding="utf-8"?>
 <ct:contentTypeSchema xmlns:ct="http://schemas.microsoft.com/office/2006/metadata/contentType" xmlns:ma="http://schemas.microsoft.com/office/2006/metadata/properties/metaAttributes" ct:_="" ma:_="" ma:contentTypeName="Document" ma:contentTypeID="0x010100A7AFF71C8571FA499649B08FEE74A217" ma:contentTypeVersion="18" ma:contentTypeDescription="Een nieuw document maken." ma:contentTypeScope="" ma:versionID="b4c91a4e0c61d896dc885b42985f2106">
   <xsd:schema xmlns:xsd="http://www.w3.org/2001/XMLSchema" xmlns:xs="http://www.w3.org/2001/XMLSchema" xmlns:p="http://schemas.microsoft.com/office/2006/metadata/properties" xmlns:ns2="c1aff267-730c-4217-94a2-113862932d84" xmlns:ns3="e576a107-c33d-4a2c-aa97-67272a71cb44" targetNamespace="http://schemas.microsoft.com/office/2006/metadata/properties" ma:root="true" ma:fieldsID="203b5d7a5dce283ef0d538957be2e021" ns2:_="" ns3:_="">
     <xsd:import namespace="c1aff267-730c-4217-94a2-113862932d84"/>
@@ -6557,27 +6921,26 @@
 </ct:contentTypeSchema>
 </file>
 
-<file path=customXml/item2.xml><?xml version="1.0" encoding="utf-8"?>
-<?mso-contentType ?>
-<FormTemplates xmlns="http://schemas.microsoft.com/sharepoint/v3/contenttype/forms">
-  <Display>DocumentLibraryForm</Display>
-  <Edit>DocumentLibraryForm</Edit>
-  <New>DocumentLibraryForm</New>
-</FormTemplates>
+<file path=customXml/itemProps1.xml><?xml version="1.0" encoding="utf-8"?>
+<ds:datastoreItem xmlns:ds="http://schemas.openxmlformats.org/officeDocument/2006/customXml" ds:itemID="{D4088B08-6418-4588-9965-EF87D2D415FA}">
+  <ds:schemaRefs>
+    <ds:schemaRef ds:uri="http://schemas.microsoft.com/office/2006/metadata/properties"/>
+    <ds:schemaRef ds:uri="http://schemas.microsoft.com/office/infopath/2007/PartnerControls"/>
+    <ds:schemaRef ds:uri="e576a107-c33d-4a2c-aa97-67272a71cb44"/>
+    <ds:schemaRef ds:uri="c1aff267-730c-4217-94a2-113862932d84"/>
+  </ds:schemaRefs>
+</ds:datastoreItem>
 </file>
 
-<file path=customXml/item3.xml><?xml version="1.0" encoding="utf-8"?>
-<p:properties xmlns:p="http://schemas.microsoft.com/office/2006/metadata/properties" xmlns:xsi="http://www.w3.org/2001/XMLSchema-instance" xmlns:pc="http://schemas.microsoft.com/office/infopath/2007/PartnerControls">
-  <documentManagement>
-    <TaxCatchAll xmlns="e576a107-c33d-4a2c-aa97-67272a71cb44"/>
-    <lcf76f155ced4ddcb4097134ff3c332f xmlns="c1aff267-730c-4217-94a2-113862932d84">
-      <Terms xmlns="http://schemas.microsoft.com/office/infopath/2007/PartnerControls"/>
-    </lcf76f155ced4ddcb4097134ff3c332f>
-  </documentManagement>
-</p:properties>
+<file path=customXml/itemProps2.xml><?xml version="1.0" encoding="utf-8"?>
+<ds:datastoreItem xmlns:ds="http://schemas.openxmlformats.org/officeDocument/2006/customXml" ds:itemID="{A1A4D0B3-C7B7-4850-A954-3E6A6A1C2CDB}">
+  <ds:schemaRefs>
+    <ds:schemaRef ds:uri="http://schemas.microsoft.com/sharepoint/v3/contenttype/forms"/>
+  </ds:schemaRefs>
+</ds:datastoreItem>
 </file>
 
-<file path=customXml/itemProps1.xml><?xml version="1.0" encoding="utf-8"?>
+<file path=customXml/itemProps3.xml><?xml version="1.0" encoding="utf-8"?>
 <ds:datastoreItem xmlns:ds="http://schemas.openxmlformats.org/officeDocument/2006/customXml" ds:itemID="{0CE72B69-2E9B-421E-9EFB-EF4BF9519277}">
   <ds:schemaRefs>
     <ds:schemaRef ds:uri="http://schemas.microsoft.com/office/2006/metadata/contentType"/>
@@ -6596,25 +6959,6 @@
 </ds:datastoreItem>
 </file>
 
-<file path=customXml/itemProps2.xml><?xml version="1.0" encoding="utf-8"?>
-<ds:datastoreItem xmlns:ds="http://schemas.openxmlformats.org/officeDocument/2006/customXml" ds:itemID="{A1A4D0B3-C7B7-4850-A954-3E6A6A1C2CDB}">
-  <ds:schemaRefs>
-    <ds:schemaRef ds:uri="http://schemas.microsoft.com/sharepoint/v3/contenttype/forms"/>
-  </ds:schemaRefs>
-</ds:datastoreItem>
-</file>
-
-<file path=customXml/itemProps3.xml><?xml version="1.0" encoding="utf-8"?>
-<ds:datastoreItem xmlns:ds="http://schemas.openxmlformats.org/officeDocument/2006/customXml" ds:itemID="{D4088B08-6418-4588-9965-EF87D2D415FA}">
-  <ds:schemaRefs>
-    <ds:schemaRef ds:uri="http://schemas.microsoft.com/office/2006/metadata/properties"/>
-    <ds:schemaRef ds:uri="http://schemas.microsoft.com/office/infopath/2007/PartnerControls"/>
-    <ds:schemaRef ds:uri="e576a107-c33d-4a2c-aa97-67272a71cb44"/>
-    <ds:schemaRef ds:uri="c1aff267-730c-4217-94a2-113862932d84"/>
-  </ds:schemaRefs>
-</ds:datastoreItem>
-</file>
-
 <file path=docMetadata/LabelInfo.xml><?xml version="1.0" encoding="utf-8"?>
 <clbl:labelList xmlns:clbl="http://schemas.microsoft.com/office/2020/mipLabelMetadata">
   <clbl:label id="{587b6ea1-3db9-4fe1-a9d7-85d4c64ce5cc}" enabled="0" method="" siteId="{587b6ea1-3db9-4fe1-a9d7-85d4c64ce5cc}" removed="1"/>

</xml_diff>